<commit_message>
Link the video walkthrough from the report and the README
Co-Authored-By: Claude Opus 5.5 <noreply@anthropic.com>
</commit_message>
<xml_diff>
--- a/report/TECHNICAL_REPORT.docx
+++ b/report/TECHNICAL_REPORT.docx
@@ -381,8 +381,8 @@
         <w:tblLook w:firstColumn="1" w:firstRow="1" w:lastColumn="0" w:lastRow="0" w:noHBand="0" w:noVBand="1" w:val="04A0"/>
       </w:tblPr>
       <w:tblGrid>
-        <w:gridCol w:w="1976"/>
-        <w:gridCol w:w="6520"/>
+        <w:gridCol w:w="1790"/>
+        <w:gridCol w:w="6706"/>
       </w:tblGrid>
       <w:tr>
         <w:trPr>
@@ -390,7 +390,7 @@
         </w:trPr>
         <w:tc>
           <w:tcPr>
-            <w:tcW w:type="dxa" w:w="1976"/>
+            <w:tcW w:type="dxa" w:w="1790"/>
             <w:shd w:val="clear" w:color="auto" w:fill="FFFFFF"/>
             <w:vAlign w:val="center"/>
           </w:tcPr>
@@ -413,7 +413,7 @@
         </w:tc>
         <w:tc>
           <w:tcPr>
-            <w:tcW w:type="dxa" w:w="6520"/>
+            <w:tcW w:type="dxa" w:w="6706"/>
             <w:shd w:val="clear" w:color="auto" w:fill="FFFFFF"/>
             <w:vAlign w:val="center"/>
           </w:tcPr>
@@ -441,7 +441,7 @@
         </w:trPr>
         <w:tc>
           <w:tcPr>
-            <w:tcW w:type="dxa" w:w="1976"/>
+            <w:tcW w:type="dxa" w:w="1790"/>
             <w:shd w:val="clear" w:color="auto" w:fill="F7F9FB"/>
             <w:vAlign w:val="center"/>
           </w:tcPr>
@@ -458,13 +458,13 @@
                 <w:color w:val="222222"/>
                 <w:sz w:val="20"/>
               </w:rPr>
-              <w:t>Verification harness</w:t>
-            </w:r>
-          </w:p>
-        </w:tc>
-        <w:tc>
-          <w:tcPr>
-            <w:tcW w:type="dxa" w:w="6520"/>
+              <w:t>Video</w:t>
+            </w:r>
+          </w:p>
+        </w:tc>
+        <w:tc>
+          <w:tcPr>
+            <w:tcW w:type="dxa" w:w="6706"/>
             <w:shd w:val="clear" w:color="auto" w:fill="F7F9FB"/>
             <w:vAlign w:val="center"/>
           </w:tcPr>
@@ -475,23 +475,13 @@
             </w:pPr>
             <w:r>
               <w:rPr>
-                <w:rFonts w:ascii="Consolas" w:hAnsi="Consolas"/>
-                <w:b w:val="0"/>
-                <w:i w:val="0"/>
-                <w:color w:val="222222"/>
-                <w:sz w:val="18"/>
-              </w:rPr>
-              <w:t>python run_all.py --quick</w:t>
-            </w:r>
-            <w:r>
-              <w:rPr>
-                <w:rFonts w:ascii="Calibri" w:hAnsi="Calibri"/>
-                <w:b w:val="0"/>
-                <w:i w:val="0"/>
-                <w:color w:val="222222"/>
-                <w:sz w:val="20"/>
-              </w:rPr>
-              <w:t xml:space="preserve"> runs the complete pipeline, models and metrics</w:t>
+                <w:rFonts w:ascii="Calibri" w:hAnsi="Calibri"/>
+                <w:b w:val="0"/>
+                <w:i w:val="0"/>
+                <w:color w:val="222222"/>
+                <w:sz w:val="20"/>
+              </w:rPr>
+              <w:t>https://www.youtube.com/watch?v=WnnD-oSFdcI, a walkthrough of the project and the demo</w:t>
             </w:r>
           </w:p>
         </w:tc>
@@ -502,7 +492,7 @@
         </w:trPr>
         <w:tc>
           <w:tcPr>
-            <w:tcW w:type="dxa" w:w="1976"/>
+            <w:tcW w:type="dxa" w:w="1790"/>
             <w:shd w:val="clear" w:color="auto" w:fill="FFFFFF"/>
             <w:vAlign w:val="center"/>
           </w:tcPr>
@@ -519,13 +509,13 @@
                 <w:color w:val="222222"/>
                 <w:sz w:val="20"/>
               </w:rPr>
-              <w:t>Audit discipline</w:t>
-            </w:r>
-          </w:p>
-        </w:tc>
-        <w:tc>
-          <w:tcPr>
-            <w:tcW w:type="dxa" w:w="6520"/>
+              <w:t>Verification harness</w:t>
+            </w:r>
+          </w:p>
+        </w:tc>
+        <w:tc>
+          <w:tcPr>
+            <w:tcW w:type="dxa" w:w="6706"/>
             <w:shd w:val="clear" w:color="auto" w:fill="FFFFFF"/>
             <w:vAlign w:val="center"/>
           </w:tcPr>
@@ -542,27 +532,17 @@
                 <w:color w:val="222222"/>
                 <w:sz w:val="18"/>
               </w:rPr>
-              <w:t>python -m neuromps.report.verify</w:t>
-            </w:r>
-            <w:r>
-              <w:rPr>
-                <w:rFonts w:ascii="Calibri" w:hAnsi="Calibri"/>
-                <w:b w:val="0"/>
-                <w:i w:val="0"/>
-                <w:color w:val="222222"/>
-                <w:sz w:val="20"/>
-              </w:rPr>
-              <w:t xml:space="preserve"> checks every number in this report against </w:t>
-            </w:r>
-            <w:r>
-              <w:rPr>
-                <w:rFonts w:ascii="Consolas" w:hAnsi="Consolas"/>
-                <w:b w:val="0"/>
-                <w:i w:val="0"/>
-                <w:color w:val="222222"/>
-                <w:sz w:val="18"/>
-              </w:rPr>
-              <w:t>outputs/metrics.json</w:t>
+              <w:t>python run_all.py --quick</w:t>
+            </w:r>
+            <w:r>
+              <w:rPr>
+                <w:rFonts w:ascii="Calibri" w:hAnsi="Calibri"/>
+                <w:b w:val="0"/>
+                <w:i w:val="0"/>
+                <w:color w:val="222222"/>
+                <w:sz w:val="20"/>
+              </w:rPr>
+              <w:t xml:space="preserve"> runs the complete pipeline, models and metrics</w:t>
             </w:r>
           </w:p>
         </w:tc>
@@ -573,12 +553,83 @@
         </w:trPr>
         <w:tc>
           <w:tcPr>
-            <w:tcW w:type="dxa" w:w="1976"/>
+            <w:tcW w:type="dxa" w:w="1790"/>
             <w:shd w:val="clear" w:color="auto" w:fill="F7F9FB"/>
             <w:vAlign w:val="center"/>
           </w:tcPr>
           <w:p>
             <w:pPr>
+              <w:keepNext/>
+              <w:spacing w:after="0"/>
+            </w:pPr>
+            <w:r>
+              <w:rPr>
+                <w:rFonts w:ascii="Calibri" w:hAnsi="Calibri"/>
+                <w:b/>
+                <w:i w:val="0"/>
+                <w:color w:val="222222"/>
+                <w:sz w:val="20"/>
+              </w:rPr>
+              <w:t>Audit discipline</w:t>
+            </w:r>
+          </w:p>
+        </w:tc>
+        <w:tc>
+          <w:tcPr>
+            <w:tcW w:type="dxa" w:w="6706"/>
+            <w:shd w:val="clear" w:color="auto" w:fill="F7F9FB"/>
+            <w:vAlign w:val="center"/>
+          </w:tcPr>
+          <w:p>
+            <w:pPr>
+              <w:keepNext/>
+              <w:spacing w:after="0"/>
+            </w:pPr>
+            <w:r>
+              <w:rPr>
+                <w:rFonts w:ascii="Consolas" w:hAnsi="Consolas"/>
+                <w:b w:val="0"/>
+                <w:i w:val="0"/>
+                <w:color w:val="222222"/>
+                <w:sz w:val="18"/>
+              </w:rPr>
+              <w:t>python -m neuromps.report.verify</w:t>
+            </w:r>
+            <w:r>
+              <w:rPr>
+                <w:rFonts w:ascii="Calibri" w:hAnsi="Calibri"/>
+                <w:b w:val="0"/>
+                <w:i w:val="0"/>
+                <w:color w:val="222222"/>
+                <w:sz w:val="20"/>
+              </w:rPr>
+              <w:t xml:space="preserve"> checks every number in this report against </w:t>
+            </w:r>
+            <w:r>
+              <w:rPr>
+                <w:rFonts w:ascii="Consolas" w:hAnsi="Consolas"/>
+                <w:b w:val="0"/>
+                <w:i w:val="0"/>
+                <w:color w:val="222222"/>
+                <w:sz w:val="18"/>
+              </w:rPr>
+              <w:t>outputs/metrics.json</w:t>
+            </w:r>
+          </w:p>
+        </w:tc>
+      </w:tr>
+      <w:tr>
+        <w:trPr>
+          <w:cantSplit/>
+        </w:trPr>
+        <w:tc>
+          <w:tcPr>
+            <w:tcW w:type="dxa" w:w="1790"/>
+            <w:shd w:val="clear" w:color="auto" w:fill="FFFFFF"/>
+            <w:vAlign w:val="center"/>
+          </w:tcPr>
+          <w:p>
+            <w:pPr>
               <w:keepNext w:val="0"/>
               <w:spacing w:after="0"/>
             </w:pPr>
@@ -596,8 +647,8 @@
         </w:tc>
         <w:tc>
           <w:tcPr>
-            <w:tcW w:type="dxa" w:w="6520"/>
-            <w:shd w:val="clear" w:color="auto" w:fill="F7F9FB"/>
+            <w:tcW w:type="dxa" w:w="6706"/>
+            <w:shd w:val="clear" w:color="auto" w:fill="FFFFFF"/>
             <w:vAlign w:val="center"/>
           </w:tcPr>
           <w:p>

</xml_diff>

<commit_message>
Regenerate the directionality sweep the report cited from before recalibration
The HD16 grid was built on 2026-09-20 and never recomputed after the twin's
density recalibration: its configuration record carried an older summary
fingerprint and older rate-matched drives, so any current run rejected it and
rebuilt. Rebuilt here, it is identical to a fresh clone's. The cheapest
configuration that reaches AUC 0.8 is now 24 electrodes per compartment
(AUC 0.8928) on all features, and 48 (AUC 0.8969) once firing rate is
regressed out inside each fold; it was 6 for both. §17, §20 and the README
now say so.

§21 states the fresh-clone result: every cited number reproduces exactly
except ten that depend on the machine - the timings, and the counts and
intervals from time-capped posterior sampling.

Co-Authored-By: Claude Opus 5.5 <noreply@anthropic.com>
</commit_message>
<xml_diff>
--- a/report/TECHNICAL_REPORT.docx
+++ b/report/TECHNICAL_REPORT.docx
@@ -9601,7 +9601,7 @@
           <w:color w:val="222222"/>
           <w:sz w:val="21"/>
         </w:rPr>
-        <w:t>One thing a twin is genuinely good at is telling you how much experiment you need. Across 120 simulated networks with known wiring, the cheapest configuration that reaches our target distinguishes asymmetric from symmetric wiring with an AUC of 0.9219, using only 6 electrodes per compartment and a 10-second recording.</w:t>
+        <w:t>One thing a twin is genuinely good at is telling you how much experiment you need. Across 120 simulated networks with known wiring, the cheapest configuration that reaches our target distinguishes asymmetric from symmetric wiring with an AUC of 0.8928, using 24 electrodes per compartment and a 10-second recording.</w:t>
       </w:r>
     </w:p>
     <w:p>
@@ -9626,7 +9626,7 @@
           <w:color w:val="222222"/>
           <w:sz w:val="21"/>
         </w:rPr>
-        <w:t xml:space="preserve"> Most of that signal is firing rate, not direction. A directional pathway delivers more excitation to its target chamber, so the target simply fires more. If we lower the receiving chamber's background drive, measured coupling asymmetry moves from 0.109 to 0.681 with the wiring unchanged. Across the sweep, drive moves the measure further than wiring does: a span of 0.671 against 0.109. Six electrodes and ten seconds will tell these cultures apart, but claiming that this reflects directional communication requires explicit rate-matching controls.</w:t>
+        <w:t xml:space="preserve"> Most of that signal is firing rate, not direction. A directional pathway delivers more excitation to its target chamber, so the target simply fires more. If we lower the receiving chamber's background drive, measured coupling asymmetry moves from 0.109 to 0.681 with the wiring unchanged. Across the sweep, drive moves the measure further than wiring does: a span of 0.671 against 0.109. Regress firing rate out of the features, inside each training fold, and the cheapest configuration doubles to 48 electrodes per compartment. Twenty-four electrodes and ten seconds will tell these cultures apart, but claiming that this reflects directional communication requires explicit rate-matching controls.</w:t>
       </w:r>
     </w:p>
     <w:p>
@@ -11059,7 +11059,7 @@
           <w:color w:val="222222"/>
           <w:sz w:val="21"/>
         </w:rPr>
-        <w:t xml:space="preserve"> Plating human iPSCs is expensive and takes weeks. The twin gives you a testbed for pre-registering an assay: the power sweep in §17 sets a minimum electrode count (6 electrodes, 10-second recordings) for distinguishing wiring regimes, and the listening-radius finding in §13 gives you a way to diagnose electrode catchment overlap in physical recordings.</w:t>
+        <w:t xml:space="preserve"> Plating human iPSCs is expensive and takes weeks. The twin gives you a testbed for pre-registering an assay: the power sweep in §17 sets a minimum electrode count (24 electrodes per compartment, 10-second recordings) for distinguishing wiring regimes, and the listening-radius finding in §13 gives you a way to diagnose electrode catchment overlap in physical recordings.</w:t>
       </w:r>
     </w:p>
     <w:p>
@@ -11838,7 +11838,7 @@
           <w:color w:val="222222"/>
           <w:sz w:val="21"/>
         </w:rPr>
-        <w:t xml:space="preserve">, as shown: the app imports NeuroMPS, which is installed only inside </w:t>
+        <w:t xml:space="preserve">, as shown. We ran these steps on a fresh clone, and every cited number reproduced exactly except ten that depend on the machine: the timings, and the counts and intervals from posterior sampling that stops at a time limit (§16). Provenance is guarded throughout: </w:t>
       </w:r>
       <w:r>
         <w:rPr>
@@ -11848,26 +11848,6 @@
           <w:color w:val="222222"/>
           <w:sz w:val="19"/>
         </w:rPr>
-        <w:t>.venv</w:t>
-      </w:r>
-      <w:r>
-        <w:rPr>
-          <w:rFonts w:ascii="Calibri" w:hAnsi="Calibri"/>
-          <w:b w:val="0"/>
-          <w:i w:val="0"/>
-          <w:color w:val="222222"/>
-          <w:sz w:val="21"/>
-        </w:rPr>
-        <w:t xml:space="preserve">, so a system-wide Streamlit cannot find it. Provenance is guarded the same way throughout: </w:t>
-      </w:r>
-      <w:r>
-        <w:rPr>
-          <w:rFonts w:ascii="Consolas" w:hAnsi="Consolas"/>
-          <w:b w:val="0"/>
-          <w:i w:val="0"/>
-          <w:color w:val="222222"/>
-          <w:sz w:val="19"/>
-        </w:rPr>
         <w:t>data/raw/MANIFEST.json</w:t>
       </w:r>
       <w:r>
@@ -11878,7 +11858,7 @@
           <w:color w:val="222222"/>
           <w:sz w:val="21"/>
         </w:rPr>
-        <w:t xml:space="preserve"> records every source's URL, license and checksum, and the build halts on any mismatch.</w:t>
+        <w:t xml:space="preserve"> records every source's URL, license and checksum.</w:t>
       </w:r>
     </w:p>
     <w:p>

</xml_diff>

<commit_message>
Draw the last seven report figures near the size they print at
Species shift, baseline comparison, platform contrast, twin calibration,
drug knobs, coupling lag and microchannel asymmetry were drawn 6-11.5 in wide
and printed at 3-3.5, so their labels printed at a third to a half of their
size. Each is now drawn close to its printed width at 300 dpi, with labels
shortened where a long one could not fit a short axis (the baseline panels'
three-line group labels became two). The microchannel legend moved outside
the axes, where it no longer covers a chip; the calibration plot's log-axis
minor labels match the others.

The model figures were redrawn by rerunning their modules and the two twin
figures from their saved results; metrics.json is unchanged. The coupling-lag
figure now sits beside the paragraph about device types, which also fills
the gap the axonal-flow figure left: main matter stays at 20 pages.

Co-Authored-By: Claude Opus 5.5 <noreply@anthropic.com>
</commit_message>
<xml_diff>
--- a/report/TECHNICAL_REPORT.docx
+++ b/report/TECHNICAL_REPORT.docx
@@ -6461,7 +6461,7 @@
       <w:r>
         <w:drawing>
           <wp:inline xmlns:a="http://schemas.openxmlformats.org/drawingml/2006/main" xmlns:pic="http://schemas.openxmlformats.org/drawingml/2006/picture">
-            <wp:extent cx="2697480" cy="2098040"/>
+            <wp:extent cx="3290925" cy="2728165"/>
             <wp:docPr id="5" name="Picture 5"/>
             <wp:cNvGraphicFramePr>
               <a:graphicFrameLocks noChangeAspect="1"/>
@@ -6482,7 +6482,7 @@
                   <pic:spPr>
                     <a:xfrm>
                       <a:off x="0" y="0"/>
-                      <a:ext cx="2697480" cy="2098040"/>
+                      <a:ext cx="3290925" cy="2728165"/>
                     </a:xfrm>
                     <a:prstGeom prst="rect"/>
                   </pic:spPr>
@@ -6528,7 +6528,7 @@
       <w:r>
         <w:drawing>
           <wp:inline xmlns:a="http://schemas.openxmlformats.org/drawingml/2006/main" xmlns:pic="http://schemas.openxmlformats.org/drawingml/2006/picture">
-            <wp:extent cx="3129076" cy="2448842"/>
+            <wp:extent cx="4046220" cy="3181789"/>
             <wp:docPr id="6" name="Picture 6"/>
             <wp:cNvGraphicFramePr>
               <a:graphicFrameLocks noChangeAspect="1"/>
@@ -6549,7 +6549,7 @@
                   <pic:spPr>
                     <a:xfrm>
                       <a:off x="0" y="0"/>
-                      <a:ext cx="3129076" cy="2448842"/>
+                      <a:ext cx="4046220" cy="3181789"/>
                     </a:xfrm>
                     <a:prstGeom prst="rect"/>
                   </pic:spPr>
@@ -6682,7 +6682,7 @@
       <w:r>
         <w:drawing>
           <wp:inline xmlns:a="http://schemas.openxmlformats.org/drawingml/2006/main" xmlns:pic="http://schemas.openxmlformats.org/drawingml/2006/picture">
-            <wp:extent cx="3129076" cy="1564538"/>
+            <wp:extent cx="3129076" cy="1891826"/>
             <wp:docPr id="7" name="Picture 7"/>
             <wp:cNvGraphicFramePr>
               <a:graphicFrameLocks noChangeAspect="1"/>
@@ -6703,7 +6703,7 @@
                   <pic:spPr>
                     <a:xfrm>
                       <a:off x="0" y="0"/>
-                      <a:ext cx="3129076" cy="1564538"/>
+                      <a:ext cx="3129076" cy="1891826"/>
                     </a:xfrm>
                     <a:prstGeom prst="rect"/>
                   </pic:spPr>
@@ -7590,7 +7590,7 @@
       <w:r>
         <w:drawing>
           <wp:inline xmlns:a="http://schemas.openxmlformats.org/drawingml/2006/main" xmlns:pic="http://schemas.openxmlformats.org/drawingml/2006/picture">
-            <wp:extent cx="2913278" cy="1529471"/>
+            <wp:extent cx="3129076" cy="1846833"/>
             <wp:docPr id="9" name="Picture 9"/>
             <wp:cNvGraphicFramePr>
               <a:graphicFrameLocks noChangeAspect="1"/>
@@ -7611,7 +7611,7 @@
                   <pic:spPr>
                     <a:xfrm>
                       <a:off x="0" y="0"/>
-                      <a:ext cx="2913278" cy="1529471"/>
+                      <a:ext cx="3129076" cy="1846833"/>
                     </a:xfrm>
                     <a:prstGeom prst="rect"/>
                   </pic:spPr>
@@ -8259,7 +8259,7 @@
       <w:r>
         <w:drawing>
           <wp:inline xmlns:a="http://schemas.openxmlformats.org/drawingml/2006/main" xmlns:pic="http://schemas.openxmlformats.org/drawingml/2006/picture">
-            <wp:extent cx="2805379" cy="1262421"/>
+            <wp:extent cx="3183026" cy="1570780"/>
             <wp:docPr id="10" name="Picture 10"/>
             <wp:cNvGraphicFramePr>
               <a:graphicFrameLocks noChangeAspect="1"/>
@@ -8280,7 +8280,7 @@
                   <pic:spPr>
                     <a:xfrm>
                       <a:off x="0" y="0"/>
-                      <a:ext cx="2805379" cy="1262421"/>
+                      <a:ext cx="3183026" cy="1570780"/>
                     </a:xfrm>
                     <a:prstGeom prst="rect"/>
                   </pic:spPr>
@@ -8381,31 +8381,6 @@
     </w:p>
     <w:p>
       <w:pPr>
-        <w:spacing w:after="120"/>
-      </w:pPr>
-      <w:r>
-        <w:rPr>
-          <w:rFonts w:ascii="Calibri" w:hAnsi="Calibri"/>
-          <w:b/>
-          <w:i w:val="0"/>
-          <w:color w:val="156082"/>
-          <w:sz w:val="21"/>
-        </w:rPr>
-        <w:t>Tissue identity drives asymmetry.</w:t>
-      </w:r>
-      <w:r>
-        <w:rPr>
-          <w:rFonts w:ascii="Calibri" w:hAnsi="Calibri"/>
-          <w:b w:val="0"/>
-          <w:i w:val="0"/>
-          <w:color w:val="222222"/>
-          <w:sz w:val="21"/>
-        </w:rPr>
-        <w:t xml:space="preserve"> Across 16 devices, we measured how asymmetric the coupling between compartments is. Devices pairing two different tissues (cortex with hippocampus) are more asymmetric, with a median of 0.138, than devices pairing a tissue with itself, median 0.094, p = 0.042. What the chambers contain matters more than the fact that they are connected.</w:t>
-      </w:r>
-    </w:p>
-    <w:p>
-      <w:pPr>
         <w:keepNext/>
         <w:spacing w:after="120"/>
       </w:pPr>
@@ -8417,17 +8392,17 @@
           <w:color w:val="156082"/>
           <w:sz w:val="21"/>
         </w:rPr>
-        <w:t>The directionality null.</w:t>
-      </w:r>
-      <w:r>
-        <w:rPr>
-          <w:rFonts w:ascii="Calibri" w:hAnsi="Calibri"/>
-          <w:b w:val="0"/>
-          <w:i w:val="0"/>
-          <w:color w:val="222222"/>
-          <w:sz w:val="21"/>
-        </w:rPr>
-        <w:t xml:space="preserve"> One deposit recorded axonal crossings directly inside the tunnels, on 10 cultures (Brewer 2021). That let us ask the question a chamber readout exists to answer: if you had only the chamber recordings, could you tell which way the axons were firing? Using all four chamber-level measures together — coupling asymmetry, peak correlation, lag and rate imbalance — a classifier reaches a balanced accuracy of 0.3854 against a chance of 0.5. That is worse than guessing. And it is not just a small-sample failure: with this many cultures, the analysis could have detected a balanced accuracy of 0.6438 if one had been there. We could only recover direction by instrumenting the microchannels themselves.</w:t>
+        <w:t>Tissue identity drives asymmetry.</w:t>
+      </w:r>
+      <w:r>
+        <w:rPr>
+          <w:rFonts w:ascii="Calibri" w:hAnsi="Calibri"/>
+          <w:b w:val="0"/>
+          <w:i w:val="0"/>
+          <w:color w:val="222222"/>
+          <w:sz w:val="21"/>
+        </w:rPr>
+        <w:t xml:space="preserve"> Across 16 devices, we measured how asymmetric the coupling between compartments is. Devices pairing two different tissues (cortex with hippocampus) are more asymmetric, with a median of 0.138, than devices pairing a tissue with itself, median 0.094, p = 0.042. What the chambers contain matters more than the fact that they are connected.</w:t>
       </w:r>
     </w:p>
     <w:p>
@@ -8439,8 +8414,101 @@
       <w:r>
         <w:drawing>
           <wp:inline xmlns:a="http://schemas.openxmlformats.org/drawingml/2006/main" xmlns:pic="http://schemas.openxmlformats.org/drawingml/2006/picture">
+            <wp:extent cx="3021177" cy="2135490"/>
+            <wp:docPr id="11" name="Picture 11"/>
+            <wp:cNvGraphicFramePr>
+              <a:graphicFrameLocks noChangeAspect="1"/>
+            </wp:cNvGraphicFramePr>
+            <a:graphic>
+              <a:graphicData uri="http://schemas.openxmlformats.org/drawingml/2006/picture">
+                <pic:pic>
+                  <pic:nvPicPr>
+                    <pic:cNvPr id="0" name="compartment_lag_by_device_type.png"/>
+                    <pic:cNvPicPr/>
+                  </pic:nvPicPr>
+                  <pic:blipFill>
+                    <a:blip r:embed="rId23"/>
+                    <a:stretch>
+                      <a:fillRect/>
+                    </a:stretch>
+                  </pic:blipFill>
+                  <pic:spPr>
+                    <a:xfrm>
+                      <a:off x="0" y="0"/>
+                      <a:ext cx="3021177" cy="2135490"/>
+                    </a:xfrm>
+                    <a:prstGeom prst="rect"/>
+                  </pic:spPr>
+                </pic:pic>
+              </a:graphicData>
+            </a:graphic>
+          </wp:inline>
+        </w:drawing>
+      </w:r>
+    </w:p>
+    <w:p>
+      <w:pPr>
+        <w:spacing w:after="200"/>
+        <w:jc w:val="center"/>
+      </w:pPr>
+      <w:r>
+        <w:rPr>
+          <w:rFonts w:ascii="Calibri" w:hAnsi="Calibri"/>
+          <w:b/>
+          <w:i/>
+          <w:color w:val="222222"/>
+          <w:sz w:val="17"/>
+        </w:rPr>
+        <w:t xml:space="preserve">Figure 11. </w:t>
+      </w:r>
+      <w:r>
+        <w:rPr>
+          <w:rFonts w:ascii="Calibri" w:hAnsi="Calibri"/>
+          <w:b w:val="0"/>
+          <w:i/>
+          <w:color w:val="222222"/>
+          <w:sz w:val="17"/>
+        </w:rPr>
+        <w:t>Inter-compartment coupling lag by device type, REAL data, one value per device: five CxCx, five HpHp, six CxHp. The two same-tissue types are indistinguishable; the heterogeneous type sits apart.</w:t>
+      </w:r>
+    </w:p>
+    <w:p>
+      <w:pPr>
+        <w:keepNext/>
+        <w:spacing w:after="120"/>
+      </w:pPr>
+      <w:r>
+        <w:rPr>
+          <w:rFonts w:ascii="Calibri" w:hAnsi="Calibri"/>
+          <w:b/>
+          <w:i w:val="0"/>
+          <w:color w:val="156082"/>
+          <w:sz w:val="21"/>
+        </w:rPr>
+        <w:t>The directionality null.</w:t>
+      </w:r>
+      <w:r>
+        <w:rPr>
+          <w:rFonts w:ascii="Calibri" w:hAnsi="Calibri"/>
+          <w:b w:val="0"/>
+          <w:i w:val="0"/>
+          <w:color w:val="222222"/>
+          <w:sz w:val="21"/>
+        </w:rPr>
+        <w:t xml:space="preserve"> One deposit recorded axonal crossings directly inside the tunnels, on 10 cultures (Brewer 2021). That let us ask the question a chamber readout exists to answer: if you had only the chamber recordings, could you tell which way the axons were firing? Using all four chamber-level measures together — coupling asymmetry, peak correlation, lag and rate imbalance — a classifier reaches a balanced accuracy of 0.3854 against a chance of 0.5. That is worse than guessing. And it is not just a small-sample failure: with this many cultures, the analysis could have detected a balanced accuracy of 0.6438 if one had been there. We could only recover direction by instrumenting the microchannels themselves.</w:t>
+      </w:r>
+    </w:p>
+    <w:p>
+      <w:pPr>
+        <w:keepNext/>
+        <w:spacing w:before="120" w:after="40"/>
+        <w:jc w:val="center"/>
+      </w:pPr>
+      <w:r>
+        <w:drawing>
+          <wp:inline xmlns:a="http://schemas.openxmlformats.org/drawingml/2006/main" xmlns:pic="http://schemas.openxmlformats.org/drawingml/2006/picture">
             <wp:extent cx="5394960" cy="2547620"/>
-            <wp:docPr id="11" name="Picture 11"/>
+            <wp:docPr id="12" name="Picture 12"/>
             <wp:cNvGraphicFramePr>
               <a:graphicFrameLocks noChangeAspect="1"/>
             </wp:cNvGraphicFramePr>
@@ -8452,7 +8520,7 @@
                     <pic:cNvPicPr/>
                   </pic:nvPicPr>
                   <pic:blipFill>
-                    <a:blip r:embed="rId23"/>
+                    <a:blip r:embed="rId24"/>
                     <a:stretch>
                       <a:fillRect/>
                     </a:stretch>
@@ -8484,7 +8552,7 @@
           <w:color w:val="222222"/>
           <w:sz w:val="17"/>
         </w:rPr>
-        <w:t xml:space="preserve">Figure 11. </w:t>
+        <w:t xml:space="preserve">Figure 12. </w:t>
       </w:r>
       <w:r>
         <w:rPr>
@@ -8495,73 +8563,6 @@
           <w:sz w:val="17"/>
         </w:rPr>
         <w:t>Measured axonal flow against chamber-level readouts, REAL recordings. The chamber measures do not order the cultures by the direction their axons actually fired.</w:t>
-      </w:r>
-    </w:p>
-    <w:p>
-      <w:pPr>
-        <w:keepNext/>
-        <w:spacing w:before="120" w:after="40"/>
-        <w:jc w:val="center"/>
-      </w:pPr>
-      <w:r>
-        <w:drawing>
-          <wp:inline xmlns:a="http://schemas.openxmlformats.org/drawingml/2006/main" xmlns:pic="http://schemas.openxmlformats.org/drawingml/2006/picture">
-            <wp:extent cx="3021177" cy="2114824"/>
-            <wp:docPr id="12" name="Picture 12"/>
-            <wp:cNvGraphicFramePr>
-              <a:graphicFrameLocks noChangeAspect="1"/>
-            </wp:cNvGraphicFramePr>
-            <a:graphic>
-              <a:graphicData uri="http://schemas.openxmlformats.org/drawingml/2006/picture">
-                <pic:pic>
-                  <pic:nvPicPr>
-                    <pic:cNvPr id="0" name="compartment_lag_by_device_type.png"/>
-                    <pic:cNvPicPr/>
-                  </pic:nvPicPr>
-                  <pic:blipFill>
-                    <a:blip r:embed="rId24"/>
-                    <a:stretch>
-                      <a:fillRect/>
-                    </a:stretch>
-                  </pic:blipFill>
-                  <pic:spPr>
-                    <a:xfrm>
-                      <a:off x="0" y="0"/>
-                      <a:ext cx="3021177" cy="2114824"/>
-                    </a:xfrm>
-                    <a:prstGeom prst="rect"/>
-                  </pic:spPr>
-                </pic:pic>
-              </a:graphicData>
-            </a:graphic>
-          </wp:inline>
-        </w:drawing>
-      </w:r>
-    </w:p>
-    <w:p>
-      <w:pPr>
-        <w:spacing w:after="200"/>
-        <w:jc w:val="center"/>
-      </w:pPr>
-      <w:r>
-        <w:rPr>
-          <w:rFonts w:ascii="Calibri" w:hAnsi="Calibri"/>
-          <w:b/>
-          <w:i/>
-          <w:color w:val="222222"/>
-          <w:sz w:val="17"/>
-        </w:rPr>
-        <w:t xml:space="preserve">Figure 12. </w:t>
-      </w:r>
-      <w:r>
-        <w:rPr>
-          <w:rFonts w:ascii="Calibri" w:hAnsi="Calibri"/>
-          <w:b w:val="0"/>
-          <w:i/>
-          <w:color w:val="222222"/>
-          <w:sz w:val="17"/>
-        </w:rPr>
-        <w:t>Inter-compartment coupling lag by device type, REAL data, one value per device: five CxCx, five HpHp, six CxHp. The two same-tissue types are indistinguishable; the heterogeneous type sits apart.</w:t>
       </w:r>
     </w:p>
     <w:p>
@@ -17313,7 +17314,7 @@
       <w:r>
         <w:drawing>
           <wp:inline xmlns:a="http://schemas.openxmlformats.org/drawingml/2006/main" xmlns:pic="http://schemas.openxmlformats.org/drawingml/2006/picture">
-            <wp:extent cx="2805379" cy="1636471"/>
+            <wp:extent cx="4585716" cy="2684467"/>
             <wp:docPr id="15" name="Picture 15"/>
             <wp:cNvGraphicFramePr>
               <a:graphicFrameLocks noChangeAspect="1"/>
@@ -17334,7 +17335,7 @@
                   <pic:spPr>
                     <a:xfrm>
                       <a:off x="0" y="0"/>
-                      <a:ext cx="2805379" cy="1636471"/>
+                      <a:ext cx="4585716" cy="2684467"/>
                     </a:xfrm>
                     <a:prstGeom prst="rect"/>
                   </pic:spPr>

</xml_diff>

<commit_message>
Restore the repository to its state at the submission deadline
The deadline was 2026-10-10 15:59:59 UTC. Two commits were pushed after it:
e5ed404 (16:35 UTC, removed the unused Kaggle notebook) and bbd75f9
(21:16 UTC, redrew seven figures and rebuilt the report files; no number or
claim changed). Both are reverted here so that what reviewers see matches what
was submitted. The work is kept and will return after judging.

Co-Authored-By: Claude Opus 5.5 <noreply@anthropic.com>
</commit_message>
<xml_diff>
--- a/report/TECHNICAL_REPORT.docx
+++ b/report/TECHNICAL_REPORT.docx
@@ -6461,7 +6461,7 @@
       <w:r>
         <w:drawing>
           <wp:inline xmlns:a="http://schemas.openxmlformats.org/drawingml/2006/main" xmlns:pic="http://schemas.openxmlformats.org/drawingml/2006/picture">
-            <wp:extent cx="3290925" cy="2728165"/>
+            <wp:extent cx="2697480" cy="2098040"/>
             <wp:docPr id="5" name="Picture 5"/>
             <wp:cNvGraphicFramePr>
               <a:graphicFrameLocks noChangeAspect="1"/>
@@ -6482,7 +6482,7 @@
                   <pic:spPr>
                     <a:xfrm>
                       <a:off x="0" y="0"/>
-                      <a:ext cx="3290925" cy="2728165"/>
+                      <a:ext cx="2697480" cy="2098040"/>
                     </a:xfrm>
                     <a:prstGeom prst="rect"/>
                   </pic:spPr>
@@ -6528,7 +6528,7 @@
       <w:r>
         <w:drawing>
           <wp:inline xmlns:a="http://schemas.openxmlformats.org/drawingml/2006/main" xmlns:pic="http://schemas.openxmlformats.org/drawingml/2006/picture">
-            <wp:extent cx="4046220" cy="3181789"/>
+            <wp:extent cx="3129076" cy="2448842"/>
             <wp:docPr id="6" name="Picture 6"/>
             <wp:cNvGraphicFramePr>
               <a:graphicFrameLocks noChangeAspect="1"/>
@@ -6549,7 +6549,7 @@
                   <pic:spPr>
                     <a:xfrm>
                       <a:off x="0" y="0"/>
-                      <a:ext cx="4046220" cy="3181789"/>
+                      <a:ext cx="3129076" cy="2448842"/>
                     </a:xfrm>
                     <a:prstGeom prst="rect"/>
                   </pic:spPr>
@@ -6682,7 +6682,7 @@
       <w:r>
         <w:drawing>
           <wp:inline xmlns:a="http://schemas.openxmlformats.org/drawingml/2006/main" xmlns:pic="http://schemas.openxmlformats.org/drawingml/2006/picture">
-            <wp:extent cx="3129076" cy="1891826"/>
+            <wp:extent cx="3129076" cy="1564538"/>
             <wp:docPr id="7" name="Picture 7"/>
             <wp:cNvGraphicFramePr>
               <a:graphicFrameLocks noChangeAspect="1"/>
@@ -6703,7 +6703,7 @@
                   <pic:spPr>
                     <a:xfrm>
                       <a:off x="0" y="0"/>
-                      <a:ext cx="3129076" cy="1891826"/>
+                      <a:ext cx="3129076" cy="1564538"/>
                     </a:xfrm>
                     <a:prstGeom prst="rect"/>
                   </pic:spPr>
@@ -7590,7 +7590,7 @@
       <w:r>
         <w:drawing>
           <wp:inline xmlns:a="http://schemas.openxmlformats.org/drawingml/2006/main" xmlns:pic="http://schemas.openxmlformats.org/drawingml/2006/picture">
-            <wp:extent cx="3129076" cy="1846833"/>
+            <wp:extent cx="2913278" cy="1529471"/>
             <wp:docPr id="9" name="Picture 9"/>
             <wp:cNvGraphicFramePr>
               <a:graphicFrameLocks noChangeAspect="1"/>
@@ -7611,7 +7611,7 @@
                   <pic:spPr>
                     <a:xfrm>
                       <a:off x="0" y="0"/>
-                      <a:ext cx="3129076" cy="1846833"/>
+                      <a:ext cx="2913278" cy="1529471"/>
                     </a:xfrm>
                     <a:prstGeom prst="rect"/>
                   </pic:spPr>
@@ -8259,7 +8259,7 @@
       <w:r>
         <w:drawing>
           <wp:inline xmlns:a="http://schemas.openxmlformats.org/drawingml/2006/main" xmlns:pic="http://schemas.openxmlformats.org/drawingml/2006/picture">
-            <wp:extent cx="3183026" cy="1570780"/>
+            <wp:extent cx="2805379" cy="1262421"/>
             <wp:docPr id="10" name="Picture 10"/>
             <wp:cNvGraphicFramePr>
               <a:graphicFrameLocks noChangeAspect="1"/>
@@ -8280,7 +8280,7 @@
                   <pic:spPr>
                     <a:xfrm>
                       <a:off x="0" y="0"/>
-                      <a:ext cx="3183026" cy="1570780"/>
+                      <a:ext cx="2805379" cy="1262421"/>
                     </a:xfrm>
                     <a:prstGeom prst="rect"/>
                   </pic:spPr>
@@ -8381,6 +8381,31 @@
     </w:p>
     <w:p>
       <w:pPr>
+        <w:spacing w:after="120"/>
+      </w:pPr>
+      <w:r>
+        <w:rPr>
+          <w:rFonts w:ascii="Calibri" w:hAnsi="Calibri"/>
+          <w:b/>
+          <w:i w:val="0"/>
+          <w:color w:val="156082"/>
+          <w:sz w:val="21"/>
+        </w:rPr>
+        <w:t>Tissue identity drives asymmetry.</w:t>
+      </w:r>
+      <w:r>
+        <w:rPr>
+          <w:rFonts w:ascii="Calibri" w:hAnsi="Calibri"/>
+          <w:b w:val="0"/>
+          <w:i w:val="0"/>
+          <w:color w:val="222222"/>
+          <w:sz w:val="21"/>
+        </w:rPr>
+        <w:t xml:space="preserve"> Across 16 devices, we measured how asymmetric the coupling between compartments is. Devices pairing two different tissues (cortex with hippocampus) are more asymmetric, with a median of 0.138, than devices pairing a tissue with itself, median 0.094, p = 0.042. What the chambers contain matters more than the fact that they are connected.</w:t>
+      </w:r>
+    </w:p>
+    <w:p>
+      <w:pPr>
         <w:keepNext/>
         <w:spacing w:after="120"/>
       </w:pPr>
@@ -8392,17 +8417,17 @@
           <w:color w:val="156082"/>
           <w:sz w:val="21"/>
         </w:rPr>
-        <w:t>Tissue identity drives asymmetry.</w:t>
-      </w:r>
-      <w:r>
-        <w:rPr>
-          <w:rFonts w:ascii="Calibri" w:hAnsi="Calibri"/>
-          <w:b w:val="0"/>
-          <w:i w:val="0"/>
-          <w:color w:val="222222"/>
-          <w:sz w:val="21"/>
-        </w:rPr>
-        <w:t xml:space="preserve"> Across 16 devices, we measured how asymmetric the coupling between compartments is. Devices pairing two different tissues (cortex with hippocampus) are more asymmetric, with a median of 0.138, than devices pairing a tissue with itself, median 0.094, p = 0.042. What the chambers contain matters more than the fact that they are connected.</w:t>
+        <w:t>The directionality null.</w:t>
+      </w:r>
+      <w:r>
+        <w:rPr>
+          <w:rFonts w:ascii="Calibri" w:hAnsi="Calibri"/>
+          <w:b w:val="0"/>
+          <w:i w:val="0"/>
+          <w:color w:val="222222"/>
+          <w:sz w:val="21"/>
+        </w:rPr>
+        <w:t xml:space="preserve"> One deposit recorded axonal crossings directly inside the tunnels, on 10 cultures (Brewer 2021). That let us ask the question a chamber readout exists to answer: if you had only the chamber recordings, could you tell which way the axons were firing? Using all four chamber-level measures together — coupling asymmetry, peak correlation, lag and rate imbalance — a classifier reaches a balanced accuracy of 0.3854 against a chance of 0.5. That is worse than guessing. And it is not just a small-sample failure: with this many cultures, the analysis could have detected a balanced accuracy of 0.6438 if one had been there. We could only recover direction by instrumenting the microchannels themselves.</w:t>
       </w:r>
     </w:p>
     <w:p>
@@ -8414,101 +8439,8 @@
       <w:r>
         <w:drawing>
           <wp:inline xmlns:a="http://schemas.openxmlformats.org/drawingml/2006/main" xmlns:pic="http://schemas.openxmlformats.org/drawingml/2006/picture">
-            <wp:extent cx="3021177" cy="2135490"/>
+            <wp:extent cx="5394960" cy="2547620"/>
             <wp:docPr id="11" name="Picture 11"/>
-            <wp:cNvGraphicFramePr>
-              <a:graphicFrameLocks noChangeAspect="1"/>
-            </wp:cNvGraphicFramePr>
-            <a:graphic>
-              <a:graphicData uri="http://schemas.openxmlformats.org/drawingml/2006/picture">
-                <pic:pic>
-                  <pic:nvPicPr>
-                    <pic:cNvPr id="0" name="compartment_lag_by_device_type.png"/>
-                    <pic:cNvPicPr/>
-                  </pic:nvPicPr>
-                  <pic:blipFill>
-                    <a:blip r:embed="rId23"/>
-                    <a:stretch>
-                      <a:fillRect/>
-                    </a:stretch>
-                  </pic:blipFill>
-                  <pic:spPr>
-                    <a:xfrm>
-                      <a:off x="0" y="0"/>
-                      <a:ext cx="3021177" cy="2135490"/>
-                    </a:xfrm>
-                    <a:prstGeom prst="rect"/>
-                  </pic:spPr>
-                </pic:pic>
-              </a:graphicData>
-            </a:graphic>
-          </wp:inline>
-        </w:drawing>
-      </w:r>
-    </w:p>
-    <w:p>
-      <w:pPr>
-        <w:spacing w:after="200"/>
-        <w:jc w:val="center"/>
-      </w:pPr>
-      <w:r>
-        <w:rPr>
-          <w:rFonts w:ascii="Calibri" w:hAnsi="Calibri"/>
-          <w:b/>
-          <w:i/>
-          <w:color w:val="222222"/>
-          <w:sz w:val="17"/>
-        </w:rPr>
-        <w:t xml:space="preserve">Figure 11. </w:t>
-      </w:r>
-      <w:r>
-        <w:rPr>
-          <w:rFonts w:ascii="Calibri" w:hAnsi="Calibri"/>
-          <w:b w:val="0"/>
-          <w:i/>
-          <w:color w:val="222222"/>
-          <w:sz w:val="17"/>
-        </w:rPr>
-        <w:t>Inter-compartment coupling lag by device type, REAL data, one value per device: five CxCx, five HpHp, six CxHp. The two same-tissue types are indistinguishable; the heterogeneous type sits apart.</w:t>
-      </w:r>
-    </w:p>
-    <w:p>
-      <w:pPr>
-        <w:keepNext/>
-        <w:spacing w:after="120"/>
-      </w:pPr>
-      <w:r>
-        <w:rPr>
-          <w:rFonts w:ascii="Calibri" w:hAnsi="Calibri"/>
-          <w:b/>
-          <w:i w:val="0"/>
-          <w:color w:val="156082"/>
-          <w:sz w:val="21"/>
-        </w:rPr>
-        <w:t>The directionality null.</w:t>
-      </w:r>
-      <w:r>
-        <w:rPr>
-          <w:rFonts w:ascii="Calibri" w:hAnsi="Calibri"/>
-          <w:b w:val="0"/>
-          <w:i w:val="0"/>
-          <w:color w:val="222222"/>
-          <w:sz w:val="21"/>
-        </w:rPr>
-        <w:t xml:space="preserve"> One deposit recorded axonal crossings directly inside the tunnels, on 10 cultures (Brewer 2021). That let us ask the question a chamber readout exists to answer: if you had only the chamber recordings, could you tell which way the axons were firing? Using all four chamber-level measures together — coupling asymmetry, peak correlation, lag and rate imbalance — a classifier reaches a balanced accuracy of 0.3854 against a chance of 0.5. That is worse than guessing. And it is not just a small-sample failure: with this many cultures, the analysis could have detected a balanced accuracy of 0.6438 if one had been there. We could only recover direction by instrumenting the microchannels themselves.</w:t>
-      </w:r>
-    </w:p>
-    <w:p>
-      <w:pPr>
-        <w:keepNext/>
-        <w:spacing w:before="120" w:after="40"/>
-        <w:jc w:val="center"/>
-      </w:pPr>
-      <w:r>
-        <w:drawing>
-          <wp:inline xmlns:a="http://schemas.openxmlformats.org/drawingml/2006/main" xmlns:pic="http://schemas.openxmlformats.org/drawingml/2006/picture">
-            <wp:extent cx="5394960" cy="2547620"/>
-            <wp:docPr id="12" name="Picture 12"/>
             <wp:cNvGraphicFramePr>
               <a:graphicFrameLocks noChangeAspect="1"/>
             </wp:cNvGraphicFramePr>
@@ -8520,7 +8452,7 @@
                     <pic:cNvPicPr/>
                   </pic:nvPicPr>
                   <pic:blipFill>
-                    <a:blip r:embed="rId24"/>
+                    <a:blip r:embed="rId23"/>
                     <a:stretch>
                       <a:fillRect/>
                     </a:stretch>
@@ -8552,6 +8484,73 @@
           <w:color w:val="222222"/>
           <w:sz w:val="17"/>
         </w:rPr>
+        <w:t xml:space="preserve">Figure 11. </w:t>
+      </w:r>
+      <w:r>
+        <w:rPr>
+          <w:rFonts w:ascii="Calibri" w:hAnsi="Calibri"/>
+          <w:b w:val="0"/>
+          <w:i/>
+          <w:color w:val="222222"/>
+          <w:sz w:val="17"/>
+        </w:rPr>
+        <w:t>Measured axonal flow against chamber-level readouts, REAL recordings. The chamber measures do not order the cultures by the direction their axons actually fired.</w:t>
+      </w:r>
+    </w:p>
+    <w:p>
+      <w:pPr>
+        <w:keepNext/>
+        <w:spacing w:before="120" w:after="40"/>
+        <w:jc w:val="center"/>
+      </w:pPr>
+      <w:r>
+        <w:drawing>
+          <wp:inline xmlns:a="http://schemas.openxmlformats.org/drawingml/2006/main" xmlns:pic="http://schemas.openxmlformats.org/drawingml/2006/picture">
+            <wp:extent cx="3021177" cy="2114824"/>
+            <wp:docPr id="12" name="Picture 12"/>
+            <wp:cNvGraphicFramePr>
+              <a:graphicFrameLocks noChangeAspect="1"/>
+            </wp:cNvGraphicFramePr>
+            <a:graphic>
+              <a:graphicData uri="http://schemas.openxmlformats.org/drawingml/2006/picture">
+                <pic:pic>
+                  <pic:nvPicPr>
+                    <pic:cNvPr id="0" name="compartment_lag_by_device_type.png"/>
+                    <pic:cNvPicPr/>
+                  </pic:nvPicPr>
+                  <pic:blipFill>
+                    <a:blip r:embed="rId24"/>
+                    <a:stretch>
+                      <a:fillRect/>
+                    </a:stretch>
+                  </pic:blipFill>
+                  <pic:spPr>
+                    <a:xfrm>
+                      <a:off x="0" y="0"/>
+                      <a:ext cx="3021177" cy="2114824"/>
+                    </a:xfrm>
+                    <a:prstGeom prst="rect"/>
+                  </pic:spPr>
+                </pic:pic>
+              </a:graphicData>
+            </a:graphic>
+          </wp:inline>
+        </w:drawing>
+      </w:r>
+    </w:p>
+    <w:p>
+      <w:pPr>
+        <w:spacing w:after="200"/>
+        <w:jc w:val="center"/>
+      </w:pPr>
+      <w:r>
+        <w:rPr>
+          <w:rFonts w:ascii="Calibri" w:hAnsi="Calibri"/>
+          <w:b/>
+          <w:i/>
+          <w:color w:val="222222"/>
+          <w:sz w:val="17"/>
+        </w:rPr>
         <w:t xml:space="preserve">Figure 12. </w:t>
       </w:r>
       <w:r>
@@ -8562,7 +8561,7 @@
           <w:color w:val="222222"/>
           <w:sz w:val="17"/>
         </w:rPr>
-        <w:t>Measured axonal flow against chamber-level readouts, REAL recordings. The chamber measures do not order the cultures by the direction their axons actually fired.</w:t>
+        <w:t>Inter-compartment coupling lag by device type, REAL data, one value per device: five CxCx, five HpHp, six CxHp. The two same-tissue types are indistinguishable; the heterogeneous type sits apart.</w:t>
       </w:r>
     </w:p>
     <w:p>
@@ -17314,7 +17313,7 @@
       <w:r>
         <w:drawing>
           <wp:inline xmlns:a="http://schemas.openxmlformats.org/drawingml/2006/main" xmlns:pic="http://schemas.openxmlformats.org/drawingml/2006/picture">
-            <wp:extent cx="4585716" cy="2684467"/>
+            <wp:extent cx="2805379" cy="1636471"/>
             <wp:docPr id="15" name="Picture 15"/>
             <wp:cNvGraphicFramePr>
               <a:graphicFrameLocks noChangeAspect="1"/>
@@ -17335,7 +17334,7 @@
                   <pic:spPr>
                     <a:xfrm>
                       <a:off x="0" y="0"/>
-                      <a:ext cx="4585716" cy="2684467"/>
+                      <a:ext cx="2805379" cy="1636471"/>
                     </a:xfrm>
                     <a:prstGeom prst="rect"/>
                   </pic:spPr>

</xml_diff>

<commit_message>
Bring back the post-deadline work now that the first round is judged
Reverts 2ecca42, which had restored the deadline state during the semi-final
review. This returns the notebook removal (e5ed404) and the seven figures
drawn near their printed size (bbd75f9).

Co-Authored-By: Claude Opus 5.5 <noreply@anthropic.com>
</commit_message>
<xml_diff>
--- a/report/TECHNICAL_REPORT.docx
+++ b/report/TECHNICAL_REPORT.docx
@@ -6461,7 +6461,7 @@
       <w:r>
         <w:drawing>
           <wp:inline xmlns:a="http://schemas.openxmlformats.org/drawingml/2006/main" xmlns:pic="http://schemas.openxmlformats.org/drawingml/2006/picture">
-            <wp:extent cx="2697480" cy="2098040"/>
+            <wp:extent cx="3290925" cy="2728165"/>
             <wp:docPr id="5" name="Picture 5"/>
             <wp:cNvGraphicFramePr>
               <a:graphicFrameLocks noChangeAspect="1"/>
@@ -6482,7 +6482,7 @@
                   <pic:spPr>
                     <a:xfrm>
                       <a:off x="0" y="0"/>
-                      <a:ext cx="2697480" cy="2098040"/>
+                      <a:ext cx="3290925" cy="2728165"/>
                     </a:xfrm>
                     <a:prstGeom prst="rect"/>
                   </pic:spPr>
@@ -6528,7 +6528,7 @@
       <w:r>
         <w:drawing>
           <wp:inline xmlns:a="http://schemas.openxmlformats.org/drawingml/2006/main" xmlns:pic="http://schemas.openxmlformats.org/drawingml/2006/picture">
-            <wp:extent cx="3129076" cy="2448842"/>
+            <wp:extent cx="4046220" cy="3181789"/>
             <wp:docPr id="6" name="Picture 6"/>
             <wp:cNvGraphicFramePr>
               <a:graphicFrameLocks noChangeAspect="1"/>
@@ -6549,7 +6549,7 @@
                   <pic:spPr>
                     <a:xfrm>
                       <a:off x="0" y="0"/>
-                      <a:ext cx="3129076" cy="2448842"/>
+                      <a:ext cx="4046220" cy="3181789"/>
                     </a:xfrm>
                     <a:prstGeom prst="rect"/>
                   </pic:spPr>
@@ -6682,7 +6682,7 @@
       <w:r>
         <w:drawing>
           <wp:inline xmlns:a="http://schemas.openxmlformats.org/drawingml/2006/main" xmlns:pic="http://schemas.openxmlformats.org/drawingml/2006/picture">
-            <wp:extent cx="3129076" cy="1564538"/>
+            <wp:extent cx="3129076" cy="1891826"/>
             <wp:docPr id="7" name="Picture 7"/>
             <wp:cNvGraphicFramePr>
               <a:graphicFrameLocks noChangeAspect="1"/>
@@ -6703,7 +6703,7 @@
                   <pic:spPr>
                     <a:xfrm>
                       <a:off x="0" y="0"/>
-                      <a:ext cx="3129076" cy="1564538"/>
+                      <a:ext cx="3129076" cy="1891826"/>
                     </a:xfrm>
                     <a:prstGeom prst="rect"/>
                   </pic:spPr>
@@ -7590,7 +7590,7 @@
       <w:r>
         <w:drawing>
           <wp:inline xmlns:a="http://schemas.openxmlformats.org/drawingml/2006/main" xmlns:pic="http://schemas.openxmlformats.org/drawingml/2006/picture">
-            <wp:extent cx="2913278" cy="1529471"/>
+            <wp:extent cx="3129076" cy="1846833"/>
             <wp:docPr id="9" name="Picture 9"/>
             <wp:cNvGraphicFramePr>
               <a:graphicFrameLocks noChangeAspect="1"/>
@@ -7611,7 +7611,7 @@
                   <pic:spPr>
                     <a:xfrm>
                       <a:off x="0" y="0"/>
-                      <a:ext cx="2913278" cy="1529471"/>
+                      <a:ext cx="3129076" cy="1846833"/>
                     </a:xfrm>
                     <a:prstGeom prst="rect"/>
                   </pic:spPr>
@@ -8259,7 +8259,7 @@
       <w:r>
         <w:drawing>
           <wp:inline xmlns:a="http://schemas.openxmlformats.org/drawingml/2006/main" xmlns:pic="http://schemas.openxmlformats.org/drawingml/2006/picture">
-            <wp:extent cx="2805379" cy="1262421"/>
+            <wp:extent cx="3183026" cy="1570780"/>
             <wp:docPr id="10" name="Picture 10"/>
             <wp:cNvGraphicFramePr>
               <a:graphicFrameLocks noChangeAspect="1"/>
@@ -8280,7 +8280,7 @@
                   <pic:spPr>
                     <a:xfrm>
                       <a:off x="0" y="0"/>
-                      <a:ext cx="2805379" cy="1262421"/>
+                      <a:ext cx="3183026" cy="1570780"/>
                     </a:xfrm>
                     <a:prstGeom prst="rect"/>
                   </pic:spPr>
@@ -8381,31 +8381,6 @@
     </w:p>
     <w:p>
       <w:pPr>
-        <w:spacing w:after="120"/>
-      </w:pPr>
-      <w:r>
-        <w:rPr>
-          <w:rFonts w:ascii="Calibri" w:hAnsi="Calibri"/>
-          <w:b/>
-          <w:i w:val="0"/>
-          <w:color w:val="156082"/>
-          <w:sz w:val="21"/>
-        </w:rPr>
-        <w:t>Tissue identity drives asymmetry.</w:t>
-      </w:r>
-      <w:r>
-        <w:rPr>
-          <w:rFonts w:ascii="Calibri" w:hAnsi="Calibri"/>
-          <w:b w:val="0"/>
-          <w:i w:val="0"/>
-          <w:color w:val="222222"/>
-          <w:sz w:val="21"/>
-        </w:rPr>
-        <w:t xml:space="preserve"> Across 16 devices, we measured how asymmetric the coupling between compartments is. Devices pairing two different tissues (cortex with hippocampus) are more asymmetric, with a median of 0.138, than devices pairing a tissue with itself, median 0.094, p = 0.042. What the chambers contain matters more than the fact that they are connected.</w:t>
-      </w:r>
-    </w:p>
-    <w:p>
-      <w:pPr>
         <w:keepNext/>
         <w:spacing w:after="120"/>
       </w:pPr>
@@ -8417,17 +8392,17 @@
           <w:color w:val="156082"/>
           <w:sz w:val="21"/>
         </w:rPr>
-        <w:t>The directionality null.</w:t>
-      </w:r>
-      <w:r>
-        <w:rPr>
-          <w:rFonts w:ascii="Calibri" w:hAnsi="Calibri"/>
-          <w:b w:val="0"/>
-          <w:i w:val="0"/>
-          <w:color w:val="222222"/>
-          <w:sz w:val="21"/>
-        </w:rPr>
-        <w:t xml:space="preserve"> One deposit recorded axonal crossings directly inside the tunnels, on 10 cultures (Brewer 2021). That let us ask the question a chamber readout exists to answer: if you had only the chamber recordings, could you tell which way the axons were firing? Using all four chamber-level measures together — coupling asymmetry, peak correlation, lag and rate imbalance — a classifier reaches a balanced accuracy of 0.3854 against a chance of 0.5. That is worse than guessing. And it is not just a small-sample failure: with this many cultures, the analysis could have detected a balanced accuracy of 0.6438 if one had been there. We could only recover direction by instrumenting the microchannels themselves.</w:t>
+        <w:t>Tissue identity drives asymmetry.</w:t>
+      </w:r>
+      <w:r>
+        <w:rPr>
+          <w:rFonts w:ascii="Calibri" w:hAnsi="Calibri"/>
+          <w:b w:val="0"/>
+          <w:i w:val="0"/>
+          <w:color w:val="222222"/>
+          <w:sz w:val="21"/>
+        </w:rPr>
+        <w:t xml:space="preserve"> Across 16 devices, we measured how asymmetric the coupling between compartments is. Devices pairing two different tissues (cortex with hippocampus) are more asymmetric, with a median of 0.138, than devices pairing a tissue with itself, median 0.094, p = 0.042. What the chambers contain matters more than the fact that they are connected.</w:t>
       </w:r>
     </w:p>
     <w:p>
@@ -8439,8 +8414,101 @@
       <w:r>
         <w:drawing>
           <wp:inline xmlns:a="http://schemas.openxmlformats.org/drawingml/2006/main" xmlns:pic="http://schemas.openxmlformats.org/drawingml/2006/picture">
+            <wp:extent cx="3021177" cy="2135490"/>
+            <wp:docPr id="11" name="Picture 11"/>
+            <wp:cNvGraphicFramePr>
+              <a:graphicFrameLocks noChangeAspect="1"/>
+            </wp:cNvGraphicFramePr>
+            <a:graphic>
+              <a:graphicData uri="http://schemas.openxmlformats.org/drawingml/2006/picture">
+                <pic:pic>
+                  <pic:nvPicPr>
+                    <pic:cNvPr id="0" name="compartment_lag_by_device_type.png"/>
+                    <pic:cNvPicPr/>
+                  </pic:nvPicPr>
+                  <pic:blipFill>
+                    <a:blip r:embed="rId23"/>
+                    <a:stretch>
+                      <a:fillRect/>
+                    </a:stretch>
+                  </pic:blipFill>
+                  <pic:spPr>
+                    <a:xfrm>
+                      <a:off x="0" y="0"/>
+                      <a:ext cx="3021177" cy="2135490"/>
+                    </a:xfrm>
+                    <a:prstGeom prst="rect"/>
+                  </pic:spPr>
+                </pic:pic>
+              </a:graphicData>
+            </a:graphic>
+          </wp:inline>
+        </w:drawing>
+      </w:r>
+    </w:p>
+    <w:p>
+      <w:pPr>
+        <w:spacing w:after="200"/>
+        <w:jc w:val="center"/>
+      </w:pPr>
+      <w:r>
+        <w:rPr>
+          <w:rFonts w:ascii="Calibri" w:hAnsi="Calibri"/>
+          <w:b/>
+          <w:i/>
+          <w:color w:val="222222"/>
+          <w:sz w:val="17"/>
+        </w:rPr>
+        <w:t xml:space="preserve">Figure 11. </w:t>
+      </w:r>
+      <w:r>
+        <w:rPr>
+          <w:rFonts w:ascii="Calibri" w:hAnsi="Calibri"/>
+          <w:b w:val="0"/>
+          <w:i/>
+          <w:color w:val="222222"/>
+          <w:sz w:val="17"/>
+        </w:rPr>
+        <w:t>Inter-compartment coupling lag by device type, REAL data, one value per device: five CxCx, five HpHp, six CxHp. The two same-tissue types are indistinguishable; the heterogeneous type sits apart.</w:t>
+      </w:r>
+    </w:p>
+    <w:p>
+      <w:pPr>
+        <w:keepNext/>
+        <w:spacing w:after="120"/>
+      </w:pPr>
+      <w:r>
+        <w:rPr>
+          <w:rFonts w:ascii="Calibri" w:hAnsi="Calibri"/>
+          <w:b/>
+          <w:i w:val="0"/>
+          <w:color w:val="156082"/>
+          <w:sz w:val="21"/>
+        </w:rPr>
+        <w:t>The directionality null.</w:t>
+      </w:r>
+      <w:r>
+        <w:rPr>
+          <w:rFonts w:ascii="Calibri" w:hAnsi="Calibri"/>
+          <w:b w:val="0"/>
+          <w:i w:val="0"/>
+          <w:color w:val="222222"/>
+          <w:sz w:val="21"/>
+        </w:rPr>
+        <w:t xml:space="preserve"> One deposit recorded axonal crossings directly inside the tunnels, on 10 cultures (Brewer 2021). That let us ask the question a chamber readout exists to answer: if you had only the chamber recordings, could you tell which way the axons were firing? Using all four chamber-level measures together — coupling asymmetry, peak correlation, lag and rate imbalance — a classifier reaches a balanced accuracy of 0.3854 against a chance of 0.5. That is worse than guessing. And it is not just a small-sample failure: with this many cultures, the analysis could have detected a balanced accuracy of 0.6438 if one had been there. We could only recover direction by instrumenting the microchannels themselves.</w:t>
+      </w:r>
+    </w:p>
+    <w:p>
+      <w:pPr>
+        <w:keepNext/>
+        <w:spacing w:before="120" w:after="40"/>
+        <w:jc w:val="center"/>
+      </w:pPr>
+      <w:r>
+        <w:drawing>
+          <wp:inline xmlns:a="http://schemas.openxmlformats.org/drawingml/2006/main" xmlns:pic="http://schemas.openxmlformats.org/drawingml/2006/picture">
             <wp:extent cx="5394960" cy="2547620"/>
-            <wp:docPr id="11" name="Picture 11"/>
+            <wp:docPr id="12" name="Picture 12"/>
             <wp:cNvGraphicFramePr>
               <a:graphicFrameLocks noChangeAspect="1"/>
             </wp:cNvGraphicFramePr>
@@ -8452,7 +8520,7 @@
                     <pic:cNvPicPr/>
                   </pic:nvPicPr>
                   <pic:blipFill>
-                    <a:blip r:embed="rId23"/>
+                    <a:blip r:embed="rId24"/>
                     <a:stretch>
                       <a:fillRect/>
                     </a:stretch>
@@ -8484,7 +8552,7 @@
           <w:color w:val="222222"/>
           <w:sz w:val="17"/>
         </w:rPr>
-        <w:t xml:space="preserve">Figure 11. </w:t>
+        <w:t xml:space="preserve">Figure 12. </w:t>
       </w:r>
       <w:r>
         <w:rPr>
@@ -8495,73 +8563,6 @@
           <w:sz w:val="17"/>
         </w:rPr>
         <w:t>Measured axonal flow against chamber-level readouts, REAL recordings. The chamber measures do not order the cultures by the direction their axons actually fired.</w:t>
-      </w:r>
-    </w:p>
-    <w:p>
-      <w:pPr>
-        <w:keepNext/>
-        <w:spacing w:before="120" w:after="40"/>
-        <w:jc w:val="center"/>
-      </w:pPr>
-      <w:r>
-        <w:drawing>
-          <wp:inline xmlns:a="http://schemas.openxmlformats.org/drawingml/2006/main" xmlns:pic="http://schemas.openxmlformats.org/drawingml/2006/picture">
-            <wp:extent cx="3021177" cy="2114824"/>
-            <wp:docPr id="12" name="Picture 12"/>
-            <wp:cNvGraphicFramePr>
-              <a:graphicFrameLocks noChangeAspect="1"/>
-            </wp:cNvGraphicFramePr>
-            <a:graphic>
-              <a:graphicData uri="http://schemas.openxmlformats.org/drawingml/2006/picture">
-                <pic:pic>
-                  <pic:nvPicPr>
-                    <pic:cNvPr id="0" name="compartment_lag_by_device_type.png"/>
-                    <pic:cNvPicPr/>
-                  </pic:nvPicPr>
-                  <pic:blipFill>
-                    <a:blip r:embed="rId24"/>
-                    <a:stretch>
-                      <a:fillRect/>
-                    </a:stretch>
-                  </pic:blipFill>
-                  <pic:spPr>
-                    <a:xfrm>
-                      <a:off x="0" y="0"/>
-                      <a:ext cx="3021177" cy="2114824"/>
-                    </a:xfrm>
-                    <a:prstGeom prst="rect"/>
-                  </pic:spPr>
-                </pic:pic>
-              </a:graphicData>
-            </a:graphic>
-          </wp:inline>
-        </w:drawing>
-      </w:r>
-    </w:p>
-    <w:p>
-      <w:pPr>
-        <w:spacing w:after="200"/>
-        <w:jc w:val="center"/>
-      </w:pPr>
-      <w:r>
-        <w:rPr>
-          <w:rFonts w:ascii="Calibri" w:hAnsi="Calibri"/>
-          <w:b/>
-          <w:i/>
-          <w:color w:val="222222"/>
-          <w:sz w:val="17"/>
-        </w:rPr>
-        <w:t xml:space="preserve">Figure 12. </w:t>
-      </w:r>
-      <w:r>
-        <w:rPr>
-          <w:rFonts w:ascii="Calibri" w:hAnsi="Calibri"/>
-          <w:b w:val="0"/>
-          <w:i/>
-          <w:color w:val="222222"/>
-          <w:sz w:val="17"/>
-        </w:rPr>
-        <w:t>Inter-compartment coupling lag by device type, REAL data, one value per device: five CxCx, five HpHp, six CxHp. The two same-tissue types are indistinguishable; the heterogeneous type sits apart.</w:t>
       </w:r>
     </w:p>
     <w:p>
@@ -17313,7 +17314,7 @@
       <w:r>
         <w:drawing>
           <wp:inline xmlns:a="http://schemas.openxmlformats.org/drawingml/2006/main" xmlns:pic="http://schemas.openxmlformats.org/drawingml/2006/picture">
-            <wp:extent cx="2805379" cy="1636471"/>
+            <wp:extent cx="4585716" cy="2684467"/>
             <wp:docPr id="15" name="Picture 15"/>
             <wp:cNvGraphicFramePr>
               <a:graphicFrameLocks noChangeAspect="1"/>
@@ -17334,7 +17335,7 @@
                   <pic:spPr>
                     <a:xfrm>
                       <a:off x="0" y="0"/>
-                      <a:ext cx="2805379" cy="1636471"/>
+                      <a:ext cx="4585716" cy="2684467"/>
                     </a:xfrm>
                     <a:prstGeom prst="rect"/>
                   </pic:spPr>

</xml_diff>

<commit_message>
Rebuild the report's Word and PDF files, and render the changes log to PDF
The committed TECHNICAL_REPORT.docx/.pdf dated from 2026-10-11 and lacked
everything since; rebuilt from the current Markdown (26 main pages, 33 in
all). POST_SUBMISSION_CHANGES gets the same Word and PDF rendering.

Co-Authored-By: Claude Opus 5.5 <noreply@anthropic.com>
</commit_message>
<xml_diff>
--- a/report/TECHNICAL_REPORT.docx
+++ b/report/TECHNICAL_REPORT.docx
@@ -813,7 +813,7 @@
           <w:color w:val="222222"/>
           <w:sz w:val="21"/>
         </w:rPr>
-        <w:t>We built NeuroMPS to tackle that problem directly, and to find out honestly how far the data can be pushed. It has four parts.</w:t>
+        <w:t>We built NeuroMPS to tackle that problem directly, and to find out honestly how far the data can be pushed. It has four parts, and after the first round we added a fifth.</w:t>
       </w:r>
     </w:p>
     <w:p>
@@ -961,7 +961,44 @@
           <w:color w:val="222222"/>
           <w:sz w:val="21"/>
         </w:rPr>
-        <w:t xml:space="preserve"> Eight of our findings set firm boundaries, and §18 pairs each with what we would do instead. For example, chamber-level readouts cannot tell which way axons are firing without electrodes inside the microchannels (0.3854 against 0.5 chance), and the twin's inverse model misses a bicuculline dose trend that two burst-rate features carry. In §20 we turn these findings into recommendations for chip designers, assay developers and analysis pipelines.</w:t>
+        <w:t xml:space="preserve"> Nine of our findings set firm boundaries, and §18 pairs each with what we would do instead. For example, chamber-level readouts cannot tell which way axons are firing without electrodes inside the microchannels (0.3854 against 0.5 chance), and the twin's inverse model misses a bicuculline dose trend that two burst-rate features carry. In §20 we turn these findings into recommendations for chip designers, assay developers and analysis pipelines.</w:t>
+      </w:r>
+    </w:p>
+    <w:p>
+      <w:pPr>
+        <w:spacing w:after="120"/>
+        <w:ind w:left="432" w:hanging="259"/>
+      </w:pPr>
+      <w:r>
+        <w:rPr>
+          <w:rFonts w:ascii="Calibri" w:hAnsi="Calibri"/>
+          <w:b w:val="0"/>
+          <w:i w:val="0"/>
+          <w:color w:val="222222"/>
+          <w:sz w:val="21"/>
+        </w:rPr>
+        <w:t>•</w:t>
+        <w:tab/>
+      </w:r>
+      <w:r>
+        <w:rPr>
+          <w:rFonts w:ascii="Calibri" w:hAnsi="Calibri"/>
+          <w:b/>
+          <w:i w:val="0"/>
+          <w:color w:val="156082"/>
+          <w:sz w:val="21"/>
+        </w:rPr>
+        <w:t>From chip to animal (Act VII, added after the first round).</w:t>
+      </w:r>
+      <w:r>
+        <w:rPr>
+          <w:rFonts w:ascii="Calibri" w:hAnsi="Calibri"/>
+          <w:b w:val="0"/>
+          <w:i w:val="0"/>
+          <w:color w:val="222222"/>
+          <w:sz w:val="21"/>
+        </w:rPr>
+        <w:t xml:space="preserve"> We applied the twin's drug knobs to a simulated whole adult fly brain built from its mapped wiring, and read it both as a chip and through the neurons that drive feeding and grooming, with every prediction registered before the runs. The chip's firing rate ranks drugs by how much they disrupt behaviour (Spearman 0.863), but in every drug family behaviour failed at a lower dose than the chip flagged; GABA block had moved firing rate by only 0.149 log2 when the brain's bitter gate on feeding had already broken. Electrodes on the brain's output tract, the fly's counterpart of a chip's microchannels, caught it in time where a planar array did not. A second, male connectome replicates the behaviour and ranking results.</w:t>
       </w:r>
     </w:p>
     <w:tbl>
@@ -1607,7 +1644,7 @@
           </w:tcPr>
           <w:p>
             <w:pPr>
-              <w:keepNext w:val="0"/>
+              <w:keepNext/>
               <w:spacing w:after="0"/>
             </w:pPr>
             <w:r>
@@ -1618,7 +1655,7 @@
                 <w:color w:val="222222"/>
                 <w:sz w:val="20"/>
               </w:rPr>
-              <w:t>Appendices: consolidated technical reference</w:t>
+              <w:t>ACT VII: From chip to animal (after round 1)</w:t>
             </w:r>
           </w:p>
         </w:tc>
@@ -1626,6 +1663,105 @@
           <w:tcPr>
             <w:tcW w:type="dxa" w:w="5437"/>
             <w:shd w:val="clear" w:color="auto" w:fill="FFFFFF"/>
+            <w:vAlign w:val="center"/>
+          </w:tcPr>
+          <w:p>
+            <w:pPr>
+              <w:keepNext/>
+              <w:spacing w:after="0"/>
+            </w:pPr>
+            <w:r>
+              <w:rPr>
+                <w:rFonts w:ascii="Calibri" w:hAnsi="Calibri"/>
+                <w:b w:val="0"/>
+                <w:i w:val="0"/>
+                <w:color w:val="222222"/>
+                <w:sz w:val="20"/>
+              </w:rPr>
+              <w:t>23. The question a chip cannot answer on its own</w:t>
+            </w:r>
+          </w:p>
+          <w:p>
+            <w:pPr>
+              <w:keepNext/>
+              <w:spacing w:after="0"/>
+            </w:pPr>
+            <w:r>
+              <w:rPr>
+                <w:rFonts w:ascii="Calibri" w:hAnsi="Calibri"/>
+                <w:b w:val="0"/>
+                <w:i w:val="0"/>
+                <w:color w:val="222222"/>
+                <w:sz w:val="20"/>
+              </w:rPr>
+              <w:t>24. The chip ranks drugs correctly and raises the alarm late</w:t>
+            </w:r>
+          </w:p>
+          <w:p>
+            <w:pPr>
+              <w:keepNext/>
+              <w:spacing w:after="0"/>
+            </w:pPr>
+            <w:r>
+              <w:rPr>
+                <w:rFonts w:ascii="Calibri" w:hAnsi="Calibri"/>
+                <w:b w:val="0"/>
+                <w:i w:val="0"/>
+                <w:color w:val="222222"/>
+                <w:sz w:val="20"/>
+              </w:rPr>
+              <w:t>25. Direction between regions, and a second brain</w:t>
+            </w:r>
+          </w:p>
+          <w:p>
+            <w:pPr>
+              <w:keepNext/>
+              <w:spacing w:after="0"/>
+            </w:pPr>
+            <w:r>
+              <w:rPr>
+                <w:rFonts w:ascii="Calibri" w:hAnsi="Calibri"/>
+                <w:b w:val="0"/>
+                <w:i w:val="0"/>
+                <w:color w:val="222222"/>
+                <w:sz w:val="20"/>
+              </w:rPr>
+              <w:t>26. What the fly study does not show</w:t>
+            </w:r>
+          </w:p>
+        </w:tc>
+      </w:tr>
+      <w:tr>
+        <w:trPr>
+          <w:cantSplit/>
+        </w:trPr>
+        <w:tc>
+          <w:tcPr>
+            <w:tcW w:type="dxa" w:w="3059"/>
+            <w:shd w:val="clear" w:color="auto" w:fill="F7F9FB"/>
+            <w:vAlign w:val="center"/>
+          </w:tcPr>
+          <w:p>
+            <w:pPr>
+              <w:keepNext w:val="0"/>
+              <w:spacing w:after="0"/>
+            </w:pPr>
+            <w:r>
+              <w:rPr>
+                <w:rFonts w:ascii="Calibri" w:hAnsi="Calibri"/>
+                <w:b/>
+                <w:i w:val="0"/>
+                <w:color w:val="222222"/>
+                <w:sz w:val="20"/>
+              </w:rPr>
+              <w:t>Appendices: consolidated technical reference</w:t>
+            </w:r>
+          </w:p>
+        </w:tc>
+        <w:tc>
+          <w:tcPr>
+            <w:tcW w:type="dxa" w:w="5437"/>
+            <w:shd w:val="clear" w:color="auto" w:fill="F7F9FB"/>
             <w:vAlign w:val="center"/>
           </w:tcPr>
           <w:p>
@@ -8334,6 +8470,51 @@
     </w:p>
     <w:p>
       <w:pPr>
+        <w:spacing w:after="120"/>
+      </w:pPr>
+      <w:r>
+        <w:rPr>
+          <w:rFonts w:ascii="Calibri" w:hAnsi="Calibri"/>
+          <w:b/>
+          <w:i w:val="0"/>
+          <w:color w:val="156082"/>
+          <w:sz w:val="21"/>
+        </w:rPr>
+        <w:t>The twin as a source of labelled training data (added after the first round).</w:t>
+      </w:r>
+      <w:r>
+        <w:rPr>
+          <w:rFonts w:ascii="Calibri" w:hAnsi="Calibri"/>
+          <w:b w:val="0"/>
+          <w:i w:val="0"/>
+          <w:color w:val="222222"/>
+          <w:sz w:val="21"/>
+        </w:rPr>
+        <w:t xml:space="preserve"> Directions are one test; recognition is a harder one. We simulated pairs for the five mechanism classes the twin has a knob for (one chip recorded twice, once with the knob moved; 30 pairs per class), trained the §5 classifier on those alone, and applied it to the 73 real Kapucu pairs. Registered before the pairs were simulated (</w:t>
+      </w:r>
+      <w:r>
+        <w:rPr>
+          <w:rFonts w:ascii="Consolas" w:hAnsi="Consolas"/>
+          <w:b w:val="0"/>
+          <w:i w:val="0"/>
+          <w:color w:val="222222"/>
+          <w:sz w:val="19"/>
+        </w:rPr>
+        <w:t>preregistration/twin_prior_classifier.json</w:t>
+      </w:r>
+      <w:r>
+        <w:rPr>
+          <w:rFonts w:ascii="Calibri" w:hAnsi="Calibri"/>
+          <w:b w:val="0"/>
+          <w:i w:val="0"/>
+          <w:color w:val="222222"/>
+          <w:sz w:val="21"/>
+        </w:rPr>
+        <w:t>), it reaches a balanced accuracy of 0.41 (95% interval 0.2808 to 0.5072, culture bootstrap) where chance is one in six, without seeing a single real label. It never recognises a sodium-channel blocker, and the reason is size, not direction: the twin's threshold range moves firing by −3.273 log2 and silences most electrodes, where the real blockers move it by −0.795 with every electrode still active. As a prior for the classifier trained on real pairs, the simulated pairs add nothing: balanced accuracy goes from 0.537 to 0.53, and the conformal sets do not shrink. Two of the three registered predictions failed. The twin can stand in for labels where there are none; where real labels exist, it does not improve on them.</w:t>
+      </w:r>
+    </w:p>
+    <w:p>
+      <w:pPr>
         <w:keepNext/>
         <w:spacing w:before="360" w:after="120"/>
       </w:pPr>
@@ -9692,10 +9873,10 @@
         <w:tblLook w:firstColumn="1" w:firstRow="1" w:lastColumn="0" w:lastRow="0" w:noHBand="0" w:noVBand="1" w:val="04A0"/>
       </w:tblPr>
       <w:tblGrid>
-        <w:gridCol w:w="312"/>
-        <w:gridCol w:w="2290"/>
-        <w:gridCol w:w="2461"/>
-        <w:gridCol w:w="3433"/>
+        <w:gridCol w:w="308"/>
+        <w:gridCol w:w="2343"/>
+        <w:gridCol w:w="2603"/>
+        <w:gridCol w:w="3242"/>
       </w:tblGrid>
       <w:tr>
         <w:trPr>
@@ -9704,7 +9885,7 @@
         </w:trPr>
         <w:tc>
           <w:tcPr>
-            <w:tcW w:type="dxa" w:w="312"/>
+            <w:tcW w:type="dxa" w:w="308"/>
             <w:shd w:val="clear" w:color="auto" w:fill="1F4E79"/>
             <w:vAlign w:val="center"/>
           </w:tcPr>
@@ -9728,7 +9909,7 @@
         </w:tc>
         <w:tc>
           <w:tcPr>
-            <w:tcW w:type="dxa" w:w="2290"/>
+            <w:tcW w:type="dxa" w:w="2343"/>
             <w:shd w:val="clear" w:color="auto" w:fill="1F4E79"/>
             <w:vAlign w:val="center"/>
           </w:tcPr>
@@ -9751,7 +9932,7 @@
         </w:tc>
         <w:tc>
           <w:tcPr>
-            <w:tcW w:type="dxa" w:w="2461"/>
+            <w:tcW w:type="dxa" w:w="2603"/>
             <w:shd w:val="clear" w:color="auto" w:fill="1F4E79"/>
             <w:vAlign w:val="center"/>
           </w:tcPr>
@@ -9774,7 +9955,7 @@
         </w:tc>
         <w:tc>
           <w:tcPr>
-            <w:tcW w:type="dxa" w:w="3433"/>
+            <w:tcW w:type="dxa" w:w="3242"/>
             <w:shd w:val="clear" w:color="auto" w:fill="1F4E79"/>
             <w:vAlign w:val="center"/>
           </w:tcPr>
@@ -9802,7 +9983,7 @@
         </w:trPr>
         <w:tc>
           <w:tcPr>
-            <w:tcW w:type="dxa" w:w="312"/>
+            <w:tcW w:type="dxa" w:w="308"/>
             <w:shd w:val="clear" w:color="auto" w:fill="FFFFFF"/>
             <w:vAlign w:val="center"/>
           </w:tcPr>
@@ -9826,7 +10007,7 @@
         </w:tc>
         <w:tc>
           <w:tcPr>
-            <w:tcW w:type="dxa" w:w="2290"/>
+            <w:tcW w:type="dxa" w:w="2343"/>
             <w:shd w:val="clear" w:color="auto" w:fill="FFFFFF"/>
             <w:vAlign w:val="center"/>
           </w:tcPr>
@@ -9849,7 +10030,7 @@
         </w:tc>
         <w:tc>
           <w:tcPr>
-            <w:tcW w:type="dxa" w:w="2461"/>
+            <w:tcW w:type="dxa" w:w="2603"/>
             <w:shd w:val="clear" w:color="auto" w:fill="FFFFFF"/>
             <w:vAlign w:val="center"/>
           </w:tcPr>
@@ -9872,7 +10053,7 @@
         </w:tc>
         <w:tc>
           <w:tcPr>
-            <w:tcW w:type="dxa" w:w="3433"/>
+            <w:tcW w:type="dxa" w:w="3242"/>
             <w:shd w:val="clear" w:color="auto" w:fill="FFFFFF"/>
             <w:vAlign w:val="center"/>
           </w:tcPr>
@@ -9900,7 +10081,7 @@
         </w:trPr>
         <w:tc>
           <w:tcPr>
-            <w:tcW w:type="dxa" w:w="312"/>
+            <w:tcW w:type="dxa" w:w="308"/>
             <w:shd w:val="clear" w:color="auto" w:fill="F7F9FB"/>
             <w:vAlign w:val="center"/>
           </w:tcPr>
@@ -9924,7 +10105,7 @@
         </w:tc>
         <w:tc>
           <w:tcPr>
-            <w:tcW w:type="dxa" w:w="2290"/>
+            <w:tcW w:type="dxa" w:w="2343"/>
             <w:shd w:val="clear" w:color="auto" w:fill="F7F9FB"/>
             <w:vAlign w:val="center"/>
           </w:tcPr>
@@ -9947,7 +10128,7 @@
         </w:tc>
         <w:tc>
           <w:tcPr>
-            <w:tcW w:type="dxa" w:w="2461"/>
+            <w:tcW w:type="dxa" w:w="2603"/>
             <w:shd w:val="clear" w:color="auto" w:fill="F7F9FB"/>
             <w:vAlign w:val="center"/>
           </w:tcPr>
@@ -9970,7 +10151,7 @@
         </w:tc>
         <w:tc>
           <w:tcPr>
-            <w:tcW w:type="dxa" w:w="3433"/>
+            <w:tcW w:type="dxa" w:w="3242"/>
             <w:shd w:val="clear" w:color="auto" w:fill="F7F9FB"/>
             <w:vAlign w:val="center"/>
           </w:tcPr>
@@ -9998,7 +10179,7 @@
         </w:trPr>
         <w:tc>
           <w:tcPr>
-            <w:tcW w:type="dxa" w:w="312"/>
+            <w:tcW w:type="dxa" w:w="308"/>
             <w:shd w:val="clear" w:color="auto" w:fill="FFFFFF"/>
             <w:vAlign w:val="center"/>
           </w:tcPr>
@@ -10022,7 +10203,7 @@
         </w:tc>
         <w:tc>
           <w:tcPr>
-            <w:tcW w:type="dxa" w:w="2290"/>
+            <w:tcW w:type="dxa" w:w="2343"/>
             <w:shd w:val="clear" w:color="auto" w:fill="FFFFFF"/>
             <w:vAlign w:val="center"/>
           </w:tcPr>
@@ -10045,7 +10226,7 @@
         </w:tc>
         <w:tc>
           <w:tcPr>
-            <w:tcW w:type="dxa" w:w="2461"/>
+            <w:tcW w:type="dxa" w:w="2603"/>
             <w:shd w:val="clear" w:color="auto" w:fill="FFFFFF"/>
             <w:vAlign w:val="center"/>
           </w:tcPr>
@@ -10068,7 +10249,7 @@
         </w:tc>
         <w:tc>
           <w:tcPr>
-            <w:tcW w:type="dxa" w:w="3433"/>
+            <w:tcW w:type="dxa" w:w="3242"/>
             <w:shd w:val="clear" w:color="auto" w:fill="FFFFFF"/>
             <w:vAlign w:val="center"/>
           </w:tcPr>
@@ -10096,7 +10277,7 @@
         </w:trPr>
         <w:tc>
           <w:tcPr>
-            <w:tcW w:type="dxa" w:w="312"/>
+            <w:tcW w:type="dxa" w:w="308"/>
             <w:shd w:val="clear" w:color="auto" w:fill="F7F9FB"/>
             <w:vAlign w:val="center"/>
           </w:tcPr>
@@ -10120,7 +10301,7 @@
         </w:tc>
         <w:tc>
           <w:tcPr>
-            <w:tcW w:type="dxa" w:w="2290"/>
+            <w:tcW w:type="dxa" w:w="2343"/>
             <w:shd w:val="clear" w:color="auto" w:fill="F7F9FB"/>
             <w:vAlign w:val="center"/>
           </w:tcPr>
@@ -10143,7 +10324,7 @@
         </w:tc>
         <w:tc>
           <w:tcPr>
-            <w:tcW w:type="dxa" w:w="2461"/>
+            <w:tcW w:type="dxa" w:w="2603"/>
             <w:shd w:val="clear" w:color="auto" w:fill="F7F9FB"/>
             <w:vAlign w:val="center"/>
           </w:tcPr>
@@ -10166,7 +10347,7 @@
         </w:tc>
         <w:tc>
           <w:tcPr>
-            <w:tcW w:type="dxa" w:w="3433"/>
+            <w:tcW w:type="dxa" w:w="3242"/>
             <w:shd w:val="clear" w:color="auto" w:fill="F7F9FB"/>
             <w:vAlign w:val="center"/>
           </w:tcPr>
@@ -10194,7 +10375,7 @@
         </w:trPr>
         <w:tc>
           <w:tcPr>
-            <w:tcW w:type="dxa" w:w="312"/>
+            <w:tcW w:type="dxa" w:w="308"/>
             <w:shd w:val="clear" w:color="auto" w:fill="FFFFFF"/>
             <w:vAlign w:val="center"/>
           </w:tcPr>
@@ -10218,7 +10399,7 @@
         </w:tc>
         <w:tc>
           <w:tcPr>
-            <w:tcW w:type="dxa" w:w="2290"/>
+            <w:tcW w:type="dxa" w:w="2343"/>
             <w:shd w:val="clear" w:color="auto" w:fill="FFFFFF"/>
             <w:vAlign w:val="center"/>
           </w:tcPr>
@@ -10241,7 +10422,7 @@
         </w:tc>
         <w:tc>
           <w:tcPr>
-            <w:tcW w:type="dxa" w:w="2461"/>
+            <w:tcW w:type="dxa" w:w="2603"/>
             <w:shd w:val="clear" w:color="auto" w:fill="FFFFFF"/>
             <w:vAlign w:val="center"/>
           </w:tcPr>
@@ -10264,7 +10445,7 @@
         </w:tc>
         <w:tc>
           <w:tcPr>
-            <w:tcW w:type="dxa" w:w="3433"/>
+            <w:tcW w:type="dxa" w:w="3242"/>
             <w:shd w:val="clear" w:color="auto" w:fill="FFFFFF"/>
             <w:vAlign w:val="center"/>
           </w:tcPr>
@@ -10292,7 +10473,7 @@
         </w:trPr>
         <w:tc>
           <w:tcPr>
-            <w:tcW w:type="dxa" w:w="312"/>
+            <w:tcW w:type="dxa" w:w="308"/>
             <w:shd w:val="clear" w:color="auto" w:fill="F7F9FB"/>
             <w:vAlign w:val="center"/>
           </w:tcPr>
@@ -10316,7 +10497,7 @@
         </w:tc>
         <w:tc>
           <w:tcPr>
-            <w:tcW w:type="dxa" w:w="2290"/>
+            <w:tcW w:type="dxa" w:w="2343"/>
             <w:shd w:val="clear" w:color="auto" w:fill="F7F9FB"/>
             <w:vAlign w:val="center"/>
           </w:tcPr>
@@ -10339,7 +10520,7 @@
         </w:tc>
         <w:tc>
           <w:tcPr>
-            <w:tcW w:type="dxa" w:w="2461"/>
+            <w:tcW w:type="dxa" w:w="2603"/>
             <w:shd w:val="clear" w:color="auto" w:fill="F7F9FB"/>
             <w:vAlign w:val="center"/>
           </w:tcPr>
@@ -10372,7 +10553,7 @@
         </w:tc>
         <w:tc>
           <w:tcPr>
-            <w:tcW w:type="dxa" w:w="3433"/>
+            <w:tcW w:type="dxa" w:w="3242"/>
             <w:shd w:val="clear" w:color="auto" w:fill="F7F9FB"/>
             <w:vAlign w:val="center"/>
           </w:tcPr>
@@ -10400,7 +10581,7 @@
         </w:trPr>
         <w:tc>
           <w:tcPr>
-            <w:tcW w:type="dxa" w:w="312"/>
+            <w:tcW w:type="dxa" w:w="308"/>
             <w:shd w:val="clear" w:color="auto" w:fill="FFFFFF"/>
             <w:vAlign w:val="center"/>
           </w:tcPr>
@@ -10424,7 +10605,7 @@
         </w:tc>
         <w:tc>
           <w:tcPr>
-            <w:tcW w:type="dxa" w:w="2290"/>
+            <w:tcW w:type="dxa" w:w="2343"/>
             <w:shd w:val="clear" w:color="auto" w:fill="FFFFFF"/>
             <w:vAlign w:val="center"/>
           </w:tcPr>
@@ -10447,7 +10628,7 @@
         </w:tc>
         <w:tc>
           <w:tcPr>
-            <w:tcW w:type="dxa" w:w="2461"/>
+            <w:tcW w:type="dxa" w:w="2603"/>
             <w:shd w:val="clear" w:color="auto" w:fill="FFFFFF"/>
             <w:vAlign w:val="center"/>
           </w:tcPr>
@@ -10470,7 +10651,7 @@
         </w:tc>
         <w:tc>
           <w:tcPr>
-            <w:tcW w:type="dxa" w:w="3433"/>
+            <w:tcW w:type="dxa" w:w="3242"/>
             <w:shd w:val="clear" w:color="auto" w:fill="FFFFFF"/>
             <w:vAlign w:val="center"/>
           </w:tcPr>
@@ -10498,12 +10679,110 @@
         </w:trPr>
         <w:tc>
           <w:tcPr>
-            <w:tcW w:type="dxa" w:w="312"/>
+            <w:tcW w:type="dxa" w:w="308"/>
             <w:shd w:val="clear" w:color="auto" w:fill="F7F9FB"/>
             <w:vAlign w:val="center"/>
           </w:tcPr>
           <w:p>
             <w:pPr>
+              <w:keepNext/>
+              <w:spacing w:after="0"/>
+              <w:jc w:val="center"/>
+            </w:pPr>
+            <w:r>
+              <w:rPr>
+                <w:rFonts w:ascii="Calibri" w:hAnsi="Calibri"/>
+                <w:b/>
+                <w:i w:val="0"/>
+                <w:color w:val="222222"/>
+                <w:sz w:val="20"/>
+              </w:rPr>
+              <w:t>8</w:t>
+            </w:r>
+          </w:p>
+        </w:tc>
+        <w:tc>
+          <w:tcPr>
+            <w:tcW w:type="dxa" w:w="2343"/>
+            <w:shd w:val="clear" w:color="auto" w:fill="F7F9FB"/>
+            <w:vAlign w:val="center"/>
+          </w:tcPr>
+          <w:p>
+            <w:pPr>
+              <w:keepNext/>
+              <w:spacing w:after="0"/>
+            </w:pPr>
+            <w:r>
+              <w:rPr>
+                <w:rFonts w:ascii="Calibri" w:hAnsi="Calibri"/>
+                <w:b w:val="0"/>
+                <w:i w:val="0"/>
+                <w:color w:val="222222"/>
+                <w:sz w:val="20"/>
+              </w:rPr>
+              <w:t>support rejection</w:t>
+            </w:r>
+          </w:p>
+        </w:tc>
+        <w:tc>
+          <w:tcPr>
+            <w:tcW w:type="dxa" w:w="2603"/>
+            <w:shd w:val="clear" w:color="auto" w:fill="F7F9FB"/>
+            <w:vAlign w:val="center"/>
+          </w:tcPr>
+          <w:p>
+            <w:pPr>
+              <w:keepNext/>
+              <w:spacing w:after="0"/>
+            </w:pPr>
+            <w:r>
+              <w:rPr>
+                <w:rFonts w:ascii="Calibri" w:hAnsi="Calibri"/>
+                <w:b w:val="0"/>
+                <w:i w:val="0"/>
+                <w:color w:val="222222"/>
+                <w:sz w:val="20"/>
+              </w:rPr>
+              <w:t>the calibrated twin cannot sample 9 of 113 real recordings</w:t>
+            </w:r>
+          </w:p>
+        </w:tc>
+        <w:tc>
+          <w:tcPr>
+            <w:tcW w:type="dxa" w:w="3242"/>
+            <w:shd w:val="clear" w:color="auto" w:fill="F7F9FB"/>
+            <w:vAlign w:val="center"/>
+          </w:tcPr>
+          <w:p>
+            <w:pPr>
+              <w:keepNext/>
+              <w:spacing w:after="0"/>
+            </w:pPr>
+            <w:r>
+              <w:rPr>
+                <w:rFonts w:ascii="Calibri" w:hAnsi="Calibri"/>
+                <w:b w:val="0"/>
+                <w:i w:val="0"/>
+                <w:color w:val="222222"/>
+                <w:sz w:val="20"/>
+              </w:rPr>
+              <w:t>treat a refusal as an out-of-distribution flag and send the recording to a person</w:t>
+            </w:r>
+          </w:p>
+        </w:tc>
+      </w:tr>
+      <w:tr>
+        <w:trPr>
+          <w:cantSplit/>
+        </w:trPr>
+        <w:tc>
+          <w:tcPr>
+            <w:tcW w:type="dxa" w:w="308"/>
+            <w:shd w:val="clear" w:color="auto" w:fill="FFFFFF"/>
+            <w:vAlign w:val="center"/>
+          </w:tcPr>
+          <w:p>
+            <w:pPr>
               <w:keepNext w:val="0"/>
               <w:spacing w:after="0"/>
               <w:jc w:val="center"/>
@@ -10516,14 +10795,14 @@
                 <w:color w:val="222222"/>
                 <w:sz w:val="20"/>
               </w:rPr>
-              <w:t>8</w:t>
-            </w:r>
-          </w:p>
-        </w:tc>
-        <w:tc>
-          <w:tcPr>
-            <w:tcW w:type="dxa" w:w="2290"/>
-            <w:shd w:val="clear" w:color="auto" w:fill="F7F9FB"/>
+              <w:t>9</w:t>
+            </w:r>
+          </w:p>
+        </w:tc>
+        <w:tc>
+          <w:tcPr>
+            <w:tcW w:type="dxa" w:w="2343"/>
+            <w:shd w:val="clear" w:color="auto" w:fill="FFFFFF"/>
             <w:vAlign w:val="center"/>
           </w:tcPr>
           <w:p>
@@ -10539,14 +10818,14 @@
                 <w:color w:val="222222"/>
                 <w:sz w:val="20"/>
               </w:rPr>
-              <w:t>support rejection</w:t>
-            </w:r>
-          </w:p>
-        </w:tc>
-        <w:tc>
-          <w:tcPr>
-            <w:tcW w:type="dxa" w:w="2461"/>
-            <w:shd w:val="clear" w:color="auto" w:fill="F7F9FB"/>
+              <w:t>vesicle depletion does not explain the GABA-A reversal (added after the first round)</w:t>
+            </w:r>
+          </w:p>
+        </w:tc>
+        <w:tc>
+          <w:tcPr>
+            <w:tcW w:type="dxa" w:w="2603"/>
+            <w:shd w:val="clear" w:color="auto" w:fill="FFFFFF"/>
             <w:vAlign w:val="center"/>
           </w:tcPr>
           <w:p>
@@ -10562,14 +10841,14 @@
                 <w:color w:val="222222"/>
                 <w:sz w:val="20"/>
               </w:rPr>
-              <w:t>the calibrated twin cannot sample 9 of 113 real recordings</w:t>
-            </w:r>
-          </w:p>
-        </w:tc>
-        <w:tc>
-          <w:tcPr>
-            <w:tcW w:type="dxa" w:w="3433"/>
-            <w:shd w:val="clear" w:color="auto" w:fill="F7F9FB"/>
+              <w:t>under strong GABA-A block the twin's firing rate rises by 2.389 log2; with depletion, by at least 0.8687; on real chips it changes by −0.335</w:t>
+            </w:r>
+          </w:p>
+        </w:tc>
+        <w:tc>
+          <w:tcPr>
+            <w:tcW w:type="dxa" w:w="3242"/>
+            <w:shd w:val="clear" w:color="auto" w:fill="FFFFFF"/>
             <w:vAlign w:val="center"/>
           </w:tcPr>
           <w:p>
@@ -10585,7 +10864,7 @@
                 <w:color w:val="222222"/>
                 <w:sz w:val="20"/>
               </w:rPr>
-              <w:t>treat a refusal as an out-of-distribution flag and send the recording to a person</w:t>
+              <w:t>do not read the twin's firing-rate direction under disinhibition as the culture's; look for the missing mechanism elsewhere (recalibrating with depression, depolarization block)</w:t>
             </w:r>
           </w:p>
         </w:tc>
@@ -10644,6 +10923,119 @@
     <w:p>
       <w:pPr>
         <w:keepNext/>
+        <w:spacing w:after="120"/>
+      </w:pPr>
+      <w:r>
+        <w:rPr>
+          <w:rFonts w:ascii="Calibri" w:hAnsi="Calibri"/>
+          <w:b/>
+          <w:i w:val="0"/>
+          <w:color w:val="156082"/>
+          <w:sz w:val="21"/>
+        </w:rPr>
+        <w:t>On the ninth.</w:t>
+      </w:r>
+      <w:r>
+        <w:rPr>
+          <w:rFonts w:ascii="Calibri" w:hAnsi="Calibri"/>
+          <w:b w:val="0"/>
+          <w:i w:val="0"/>
+          <w:color w:val="222222"/>
+          <w:sz w:val="21"/>
+        </w:rPr>
+        <w:t xml:space="preserve"> A reviewer of the first round suggested that the twin raises firing rate under GABA-A block, where real chips lower it, because it lacks presynaptic vesicle depletion: in a dense culture, disinhibited bursts should exhaust the excitatory synapses and silence the network between them. It is a good hypothesis and the twin can test it, so we registered the test before running it (</w:t>
+      </w:r>
+      <w:r>
+        <w:rPr>
+          <w:rFonts w:ascii="Consolas" w:hAnsi="Consolas"/>
+          <w:b w:val="0"/>
+          <w:i w:val="0"/>
+          <w:color w:val="222222"/>
+          <w:sz w:val="19"/>
+        </w:rPr>
+        <w:t>preregistration/twin_depression_under_block.json</w:t>
+      </w:r>
+      <w:r>
+        <w:rPr>
+          <w:rFonts w:ascii="Calibri" w:hAnsi="Calibri"/>
+          <w:b w:val="0"/>
+          <w:i w:val="0"/>
+          <w:color w:val="222222"/>
+          <w:sz w:val="21"/>
+        </w:rPr>
+        <w:t>). We ran the four drug knobs and a five-step GABA-A dose series under each of the 7 depression settings of §13's earlier check. Depletion shrinks the rise, the more so the stronger it is, but in none of them does firing rate fall (0 settings), and in none do both burst rates fall with dose, as they do on real chips. The weights were not recalibrated with depression in place, so this does not rule the mechanism out; it does rule out depletion added to the present twin as the explanation.</w:t>
+      </w:r>
+    </w:p>
+    <w:p>
+      <w:pPr>
+        <w:keepNext/>
+        <w:spacing w:before="120" w:after="40"/>
+        <w:jc w:val="center"/>
+      </w:pPr>
+      <w:r>
+        <w:drawing>
+          <wp:inline xmlns:a="http://schemas.openxmlformats.org/drawingml/2006/main" xmlns:pic="http://schemas.openxmlformats.org/drawingml/2006/picture">
+            <wp:extent cx="3884371" cy="2141311"/>
+            <wp:docPr id="14" name="Picture 14"/>
+            <wp:cNvGraphicFramePr>
+              <a:graphicFrameLocks noChangeAspect="1"/>
+            </wp:cNvGraphicFramePr>
+            <a:graphic>
+              <a:graphicData uri="http://schemas.openxmlformats.org/drawingml/2006/picture">
+                <pic:pic>
+                  <pic:nvPicPr>
+                    <pic:cNvPr id="0" name="depression_under_block_simulated.png"/>
+                    <pic:cNvPicPr/>
+                  </pic:nvPicPr>
+                  <pic:blipFill>
+                    <a:blip r:embed="rId26"/>
+                    <a:stretch>
+                      <a:fillRect/>
+                    </a:stretch>
+                  </pic:blipFill>
+                  <pic:spPr>
+                    <a:xfrm>
+                      <a:off x="0" y="0"/>
+                      <a:ext cx="3884371" cy="2141311"/>
+                    </a:xfrm>
+                    <a:prstGeom prst="rect"/>
+                  </pic:spPr>
+                </pic:pic>
+              </a:graphicData>
+            </a:graphic>
+          </wp:inline>
+        </w:drawing>
+      </w:r>
+    </w:p>
+    <w:p>
+      <w:pPr>
+        <w:spacing w:after="200"/>
+        <w:jc w:val="center"/>
+      </w:pPr>
+      <w:r>
+        <w:rPr>
+          <w:rFonts w:ascii="Calibri" w:hAnsi="Calibri"/>
+          <w:b/>
+          <w:i/>
+          <w:color w:val="222222"/>
+          <w:sz w:val="17"/>
+        </w:rPr>
+        <w:t xml:space="preserve">Figure 14. </w:t>
+      </w:r>
+      <w:r>
+        <w:rPr>
+          <w:rFonts w:ascii="Calibri" w:hAnsi="Calibri"/>
+          <w:b w:val="0"/>
+          <w:i/>
+          <w:color w:val="222222"/>
+          <w:sz w:val="17"/>
+        </w:rPr>
+        <w:t>Firing-rate change under strong GABA-A block in the SIMULATED twin, per vesicle-depletion setting, against the REAL median change on GABA-A antagonist pairs. Depletion shrinks the rise; no setting reverses it.</w:t>
+      </w:r>
+    </w:p>
+    <w:p>
+      <w:pPr>
+        <w:keepNext/>
         <w:spacing w:before="240" w:after="60"/>
       </w:pPr>
       <w:r>
@@ -10960,7 +11352,7 @@
           <w:color w:val="222222"/>
           <w:sz w:val="21"/>
         </w:rPr>
-        <w:t>The main bottleneck in making neural organ-on-a-chip systems useful is not microfluidic fabrication; it is making functional electrophysiology interpretable and reproducible. Academic centers and commercial vendors alike produce multi-channel MEA recordings that remain hard to compare across sites. Our results translate into practical guidance in four areas.</w:t>
+        <w:t>The main bottleneck in making neural organ-on-a-chip systems useful is not microfluidic fabrication; it is making functional electrophysiology interpretable and reproducible. Academic centers and commercial vendors alike produce multi-channel MEA recordings that remain hard to compare across sites. Our results translate into practical guidance in five areas.</w:t>
       </w:r>
     </w:p>
     <w:p>
@@ -11086,6 +11478,31 @@
           <w:sz w:val="21"/>
         </w:rPr>
         <w:t xml:space="preserve"> Resting firing rates in primary cultures span an order of magnitude. Expressing screening features as paired log-ratios against each well's own baseline stabilizes the analysis, raises posterior contraction from 0.3 to 0.5375, and removes most of the false-disinhibition artifact described in §16.</w:t>
+      </w:r>
+    </w:p>
+    <w:p>
+      <w:pPr>
+        <w:spacing w:after="120"/>
+      </w:pPr>
+      <w:r>
+        <w:rPr>
+          <w:rFonts w:ascii="Calibri" w:hAnsi="Calibri"/>
+          <w:b/>
+          <w:i w:val="0"/>
+          <w:color w:val="156082"/>
+          <w:sz w:val="21"/>
+        </w:rPr>
+        <w:t>5. Sensitivity targets for an assay, set by a mapped brain (Act VII, added after the first round).</w:t>
+      </w:r>
+      <w:r>
+        <w:rPr>
+          <w:rFonts w:ascii="Calibri" w:hAnsi="Calibri"/>
+          <w:b w:val="0"/>
+          <w:i w:val="0"/>
+          <w:color w:val="222222"/>
+          <w:sz w:val="21"/>
+        </w:rPr>
+        <w:t xml:space="preserve"> An MEA assay is useful only if it flags a compound before the compound disturbs what a nervous system does. On a simulated fly brain, behaviour failed while the chip's firing rate had moved by as little as 0.149 log2 under GABA block. Two consequences follow for assay design, both from simulation and both to be checked on real tissue. First, measure each readout's untreated variation and state it: an assay meant to catch disinhibition in time needs firing-rate noise below that level, which the best real controls in our asset only just reach. Second, read a screen's hit threshold for what it can miss: the EPA's acute MEA screen calls a firing-rate hit only beyond a change of about −1.784 log2, 5.87 times the largest firing-rate change at which the fly's behaviour had already failed. That threshold is a reasonable guard against false hits; it is not evidence that a compound below it leaves circuits untouched. Third, where to record matters as much as how precisely: in the same simulation, electrodes on the brain's output tract caught GABA block in time where a planar array did not (§24), the same advice §15 gives from real devices: instrument the channels.</w:t>
       </w:r>
     </w:p>
     <w:p>
@@ -11951,6 +12368,1440 @@
           <w:sz w:val="21"/>
         </w:rPr>
         <w:t xml:space="preserve"> records what we tried and abandoned. No AI model is part of the delivered pipeline itself: every statistical model in it is trained from scratch on the data described here.</w:t>
+      </w:r>
+    </w:p>
+    <w:p>
+      <w:pPr>
+        <w:keepNext/>
+        <w:spacing w:before="360" w:after="120"/>
+      </w:pPr>
+      <w:r>
+        <w:rPr>
+          <w:rFonts w:ascii="Calibri" w:hAnsi="Calibri"/>
+          <w:b/>
+          <w:i w:val="0"/>
+          <w:color w:val="2F5597"/>
+          <w:sz w:val="27"/>
+        </w:rPr>
+        <w:t>ACT VII: From chip to animal (after round 1)</w:t>
+      </w:r>
+    </w:p>
+    <w:p>
+      <w:pPr>
+        <w:spacing w:after="120"/>
+      </w:pPr>
+      <w:r>
+        <w:rPr>
+          <w:rFonts w:ascii="Calibri" w:hAnsi="Calibri"/>
+          <w:b w:val="0"/>
+          <w:i/>
+          <w:color w:val="222222"/>
+          <w:sz w:val="21"/>
+        </w:rPr>
+        <w:t xml:space="preserve">Added after the first-round deadline; `report/POST_SUBMISSION_CHANGES.md` records every change since the submission. Every result in this act is from </w:t>
+      </w:r>
+      <w:r>
+        <w:rPr>
+          <w:rFonts w:ascii="Calibri" w:hAnsi="Calibri"/>
+          <w:b w:val="0"/>
+          <w:i/>
+          <w:color w:val="222222"/>
+          <w:sz w:val="21"/>
+        </w:rPr>
+        <w:t>simulation</w:t>
+      </w:r>
+      <w:r>
+        <w:rPr>
+          <w:rFonts w:ascii="Calibri" w:hAnsi="Calibri"/>
+          <w:b w:val="0"/>
+          <w:i/>
+          <w:color w:val="222222"/>
+          <w:sz w:val="21"/>
+        </w:rPr>
+        <w:t>, for research decision support; nothing in it is a claim about any compound's effect in any animal or person.</w:t>
+      </w:r>
+    </w:p>
+    <w:p>
+      <w:pPr>
+        <w:keepNext/>
+        <w:spacing w:before="240" w:after="60"/>
+      </w:pPr>
+      <w:r>
+        <w:rPr>
+          <w:rFonts w:ascii="Calibri" w:hAnsi="Calibri"/>
+          <w:b/>
+          <w:i w:val="0"/>
+          <w:color w:val="1F4E79"/>
+          <w:sz w:val="23"/>
+        </w:rPr>
+        <w:t>23. The question a chip cannot answer on its own</w:t>
+      </w:r>
+    </w:p>
+    <w:p>
+      <w:pPr>
+        <w:spacing w:after="120"/>
+      </w:pPr>
+      <w:r>
+        <w:rPr>
+          <w:rFonts w:ascii="Calibri" w:hAnsi="Calibri"/>
+          <w:b w:val="0"/>
+          <w:i w:val="0"/>
+          <w:color w:val="222222"/>
+          <w:sz w:val="21"/>
+        </w:rPr>
+        <w:t xml:space="preserve">A neural chip reports what a drug does to a dish of neurons. The question an assay is used to answer is different: will the drug disturb what a nervous system </w:t>
+      </w:r>
+      <w:r>
+        <w:rPr>
+          <w:rFonts w:ascii="Calibri" w:hAnsi="Calibri"/>
+          <w:b w:val="0"/>
+          <w:i/>
+          <w:color w:val="222222"/>
+          <w:sz w:val="21"/>
+        </w:rPr>
+        <w:t>does</w:t>
+      </w:r>
+      <w:r>
+        <w:rPr>
+          <w:rFonts w:ascii="Calibri" w:hAnsi="Calibri"/>
+          <w:b w:val="0"/>
+          <w:i w:val="0"/>
+          <w:color w:val="222222"/>
+          <w:sz w:val="21"/>
+        </w:rPr>
+        <w:t>? No culture can answer that, and so no chip assay can be checked against it. A mapped brain lets us ask. The adult fly brain has been reconstructed synapse by synapse, and Shiu et al. (2024) turned that wiring diagram into a leaky integrate-and-fire model whose responses match the fly's own sensorimotor pathways.</w:t>
+      </w:r>
+    </w:p>
+    <w:p>
+      <w:pPr>
+        <w:spacing w:after="120"/>
+      </w:pPr>
+      <w:r>
+        <w:rPr>
+          <w:rFonts w:ascii="Calibri" w:hAnsi="Calibri"/>
+          <w:b w:val="0"/>
+          <w:i w:val="0"/>
+          <w:color w:val="222222"/>
+          <w:sz w:val="21"/>
+        </w:rPr>
+        <w:t>We applied the twin's drug knobs to that model on the FlyWire connectome, 138,639 neurons joined by 15,091,983 connections, and read the same simulated brain two ways at once:</w:t>
+      </w:r>
+    </w:p>
+    <w:p>
+      <w:pPr>
+        <w:spacing w:after="120"/>
+        <w:ind w:left="432" w:hanging="259"/>
+      </w:pPr>
+      <w:r>
+        <w:rPr>
+          <w:rFonts w:ascii="Calibri" w:hAnsi="Calibri"/>
+          <w:b w:val="0"/>
+          <w:i w:val="0"/>
+          <w:color w:val="222222"/>
+          <w:sz w:val="21"/>
+        </w:rPr>
+        <w:t>•</w:t>
+        <w:tab/>
+      </w:r>
+      <w:r>
+        <w:rPr>
+          <w:rFonts w:ascii="Calibri" w:hAnsi="Calibri"/>
+          <w:b/>
+          <w:i w:val="0"/>
+          <w:color w:val="156082"/>
+          <w:sz w:val="21"/>
+        </w:rPr>
+        <w:t>as a chip</w:t>
+      </w:r>
+      <w:r>
+        <w:rPr>
+          <w:rFonts w:ascii="Calibri" w:hAnsi="Calibri"/>
+          <w:b w:val="0"/>
+          <w:i w:val="0"/>
+          <w:color w:val="222222"/>
+          <w:sz w:val="21"/>
+        </w:rPr>
+        <w:t xml:space="preserve">: a virtual electrode array laid over the brain's regions, each electrode hearing one neuron, its recordings scored by </w:t>
+      </w:r>
+      <w:r>
+        <w:rPr>
+          <w:rFonts w:ascii="Consolas" w:hAnsi="Consolas"/>
+          <w:b w:val="0"/>
+          <w:i w:val="0"/>
+          <w:color w:val="222222"/>
+          <w:sz w:val="19"/>
+        </w:rPr>
+        <w:t>features/mea.py</w:t>
+      </w:r>
+      <w:r>
+        <w:rPr>
+          <w:rFonts w:ascii="Calibri" w:hAnsi="Calibri"/>
+          <w:b w:val="0"/>
+          <w:i w:val="0"/>
+          <w:color w:val="222222"/>
+          <w:sz w:val="21"/>
+        </w:rPr>
+        <w:t>, the extractor every real recording in the asset goes through;</w:t>
+      </w:r>
+    </w:p>
+    <w:p>
+      <w:pPr>
+        <w:spacing w:after="120"/>
+        <w:ind w:left="432" w:hanging="259"/>
+      </w:pPr>
+      <w:r>
+        <w:rPr>
+          <w:rFonts w:ascii="Calibri" w:hAnsi="Calibri"/>
+          <w:b w:val="0"/>
+          <w:i w:val="0"/>
+          <w:color w:val="222222"/>
+          <w:sz w:val="21"/>
+        </w:rPr>
+        <w:t>•</w:t>
+        <w:tab/>
+      </w:r>
+      <w:r>
+        <w:rPr>
+          <w:rFonts w:ascii="Calibri" w:hAnsi="Calibri"/>
+          <w:b/>
+          <w:i w:val="0"/>
+          <w:color w:val="156082"/>
+          <w:sz w:val="21"/>
+        </w:rPr>
+        <w:t>as an animal</w:t>
+      </w:r>
+      <w:r>
+        <w:rPr>
+          <w:rFonts w:ascii="Calibri" w:hAnsi="Calibri"/>
+          <w:b w:val="0"/>
+          <w:i w:val="0"/>
+          <w:color w:val="222222"/>
+          <w:sz w:val="21"/>
+        </w:rPr>
+        <w:t>: the neurons the published model validated against behaviour. MN9, the proboscis motor neuron, under sugar drive (feeding) and again with bitter drive added (aversive gating); aBN1 under antennal mechanosensory drive (grooming); and how many descending neurons the sugar drive recruits (how selectively one stimulus reaches one output).</w:t>
+      </w:r>
+    </w:p>
+    <w:p>
+      <w:pPr>
+        <w:spacing w:after="120"/>
+      </w:pPr>
+      <w:r>
+        <w:rPr>
+          <w:rFonts w:ascii="Calibri" w:hAnsi="Calibri"/>
+          <w:b w:val="0"/>
+          <w:i w:val="0"/>
+          <w:color w:val="222222"/>
+          <w:sz w:val="21"/>
+        </w:rPr>
+        <w:t>Five drug families were each run at four or five strengths: GABA block, block of the glutamate-gated chloride channel (GluCl), GABA potentiation, acetylcholine block and a raised spike threshold. In the fly, GABA and glutamate are the fast inhibitory transmitters and acetylcholine the fast excitatory one, so these are the fly's counterparts of the twin's GABA-A, AMPA and sodium-channel knobs (§14). Behaviour is summarised by a disruption index: the mean absolute log2 change of the four readouts.</w:t>
+      </w:r>
+    </w:p>
+    <w:p>
+      <w:pPr>
+        <w:spacing w:after="120"/>
+      </w:pPr>
+      <w:r>
+        <w:rPr>
+          <w:rFonts w:ascii="Calibri" w:hAnsi="Calibri"/>
+          <w:b/>
+          <w:i w:val="0"/>
+          <w:color w:val="156082"/>
+          <w:sz w:val="21"/>
+        </w:rPr>
+        <w:t>How it was kept honest.</w:t>
+      </w:r>
+      <w:r>
+        <w:rPr>
+          <w:rFonts w:ascii="Calibri" w:hAnsi="Calibri"/>
+          <w:b w:val="0"/>
+          <w:i w:val="0"/>
+          <w:color w:val="222222"/>
+          <w:sz w:val="21"/>
+        </w:rPr>
+        <w:t xml:space="preserve"> The design, ten predictions and their pass/fail tests were committed before the simulations were run (</w:t>
+      </w:r>
+      <w:r>
+        <w:rPr>
+          <w:rFonts w:ascii="Consolas" w:hAnsi="Consolas"/>
+          <w:b w:val="0"/>
+          <w:i w:val="0"/>
+          <w:color w:val="222222"/>
+          <w:sz w:val="19"/>
+        </w:rPr>
+        <w:t>preregistration/fly_chip_to_animal.json</w:t>
+      </w:r>
+      <w:r>
+        <w:rPr>
+          <w:rFonts w:ascii="Calibri" w:hAnsi="Calibri"/>
+          <w:b w:val="0"/>
+          <w:i w:val="0"/>
+          <w:color w:val="222222"/>
+          <w:sz w:val="21"/>
+        </w:rPr>
+        <w:t xml:space="preserve">; its commit and checksum are in </w:t>
+      </w:r>
+      <w:r>
+        <w:rPr>
+          <w:rFonts w:ascii="Consolas" w:hAnsi="Consolas"/>
+          <w:b w:val="0"/>
+          <w:i w:val="0"/>
+          <w:color w:val="222222"/>
+          <w:sz w:val="19"/>
+        </w:rPr>
+        <w:t>fly_chip_to_animal.registration</w:t>
+      </w:r>
+      <w:r>
+        <w:rPr>
+          <w:rFonts w:ascii="Calibri" w:hAnsi="Calibri"/>
+          <w:b w:val="0"/>
+          <w:i w:val="0"/>
+          <w:color w:val="222222"/>
+          <w:sz w:val="21"/>
+        </w:rPr>
+        <w:t>), together with every exploratory result seen before registering. Two later addenda followed the same rule. The published neuron lists come from an older FlyWire release than the one we model, and a neuron's identifier changes when it is edited, so the code keeps only neurons whose identifier is unchanged and refuses any table that covers too few of the model's neurons; the two tables we use cover 0.9999 and 0.9964 of them. With the same code, sugar drives MN9 at 76.75 Hz on our release and 77.375 Hz on the paper's.</w:t>
+      </w:r>
+    </w:p>
+    <w:p>
+      <w:pPr>
+        <w:keepNext/>
+        <w:spacing w:before="240" w:after="60"/>
+      </w:pPr>
+      <w:r>
+        <w:rPr>
+          <w:rFonts w:ascii="Calibri" w:hAnsi="Calibri"/>
+          <w:b/>
+          <w:i w:val="0"/>
+          <w:color w:val="1F4E79"/>
+          <w:sz w:val="23"/>
+        </w:rPr>
+        <w:t>24. The chip ranks drugs correctly and raises the alarm late</w:t>
+      </w:r>
+    </w:p>
+    <w:p>
+      <w:pPr>
+        <w:keepNext/>
+        <w:spacing w:before="120" w:after="40"/>
+        <w:jc w:val="center"/>
+      </w:pPr>
+      <w:r>
+        <w:drawing>
+          <wp:inline xmlns:a="http://schemas.openxmlformats.org/drawingml/2006/main" xmlns:pic="http://schemas.openxmlformats.org/drawingml/2006/picture">
+            <wp:extent cx="5394960" cy="3245303"/>
+            <wp:docPr id="15" name="Picture 15"/>
+            <wp:cNvGraphicFramePr>
+              <a:graphicFrameLocks noChangeAspect="1"/>
+            </wp:cNvGraphicFramePr>
+            <a:graphic>
+              <a:graphicData uri="http://schemas.openxmlformats.org/drawingml/2006/picture">
+                <pic:pic>
+                  <pic:nvPicPr>
+                    <pic:cNvPr id="0" name="fly_chip_to_animal_dose_SIMULATED.png"/>
+                    <pic:cNvPicPr/>
+                  </pic:nvPicPr>
+                  <pic:blipFill>
+                    <a:blip r:embed="rId27"/>
+                    <a:stretch>
+                      <a:fillRect/>
+                    </a:stretch>
+                  </pic:blipFill>
+                  <pic:spPr>
+                    <a:xfrm>
+                      <a:off x="0" y="0"/>
+                      <a:ext cx="5394960" cy="3245303"/>
+                    </a:xfrm>
+                    <a:prstGeom prst="rect"/>
+                  </pic:spPr>
+                </pic:pic>
+              </a:graphicData>
+            </a:graphic>
+          </wp:inline>
+        </w:drawing>
+      </w:r>
+    </w:p>
+    <w:p>
+      <w:pPr>
+        <w:spacing w:after="200"/>
+        <w:jc w:val="center"/>
+      </w:pPr>
+      <w:r>
+        <w:rPr>
+          <w:rFonts w:ascii="Calibri" w:hAnsi="Calibri"/>
+          <w:b/>
+          <w:i/>
+          <w:color w:val="222222"/>
+          <w:sz w:val="17"/>
+        </w:rPr>
+        <w:t xml:space="preserve">Figure 15. </w:t>
+      </w:r>
+      <w:r>
+        <w:rPr>
+          <w:rFonts w:ascii="Calibri" w:hAnsi="Calibri"/>
+          <w:b w:val="0"/>
+          <w:i/>
+          <w:color w:val="222222"/>
+          <w:sz w:val="17"/>
+        </w:rPr>
+        <w:t>Chip readouts and behaviour readouts of the SIMULATED fly brain against dose, one line per drug family. Top: the virtual array's firing-rate and synchrony changes, and MN9 under sugar drive. Bottom: MN9 with bitter drive added, aBN1 under antennal drive, and the disruption index.</w:t>
+      </w:r>
+    </w:p>
+    <w:p>
+      <w:pPr>
+        <w:spacing w:after="120"/>
+      </w:pPr>
+      <w:r>
+        <w:rPr>
+          <w:rFonts w:ascii="Calibri" w:hAnsi="Calibri"/>
+          <w:b/>
+          <w:i w:val="0"/>
+          <w:color w:val="156082"/>
+          <w:sz w:val="21"/>
+        </w:rPr>
+        <w:t>Behaviour responds as the circuits predict.</w:t>
+      </w:r>
+      <w:r>
+        <w:rPr>
+          <w:rFonts w:ascii="Calibri" w:hAnsi="Calibri"/>
+          <w:b w:val="0"/>
+          <w:i w:val="0"/>
+          <w:color w:val="222222"/>
+          <w:sz w:val="21"/>
+        </w:rPr>
+        <w:t xml:space="preserve"> Blocking GABA releases feeding from bitter suppression (rank correlation with dose 1.0) and recruits ever more descending neurons (1.0): the brain loses its selectivity. Blocking acetylcholine silences the motor and grooming outputs.</w:t>
+      </w:r>
+    </w:p>
+    <w:p>
+      <w:pPr>
+        <w:spacing w:after="120"/>
+      </w:pPr>
+      <w:r>
+        <w:rPr>
+          <w:rFonts w:ascii="Calibri" w:hAnsi="Calibri"/>
+          <w:b/>
+          <w:i w:val="0"/>
+          <w:color w:val="156082"/>
+          <w:sz w:val="21"/>
+        </w:rPr>
+        <w:t>The chip ranks drugs by their effect on behaviour.</w:t>
+      </w:r>
+      <w:r>
+        <w:rPr>
+          <w:rFonts w:ascii="Calibri" w:hAnsi="Calibri"/>
+          <w:b w:val="0"/>
+          <w:i w:val="0"/>
+          <w:color w:val="222222"/>
+          <w:sz w:val="21"/>
+        </w:rPr>
+        <w:t xml:space="preserve"> Across the 21 drug conditions, the change in the array's firing rate tracks the disruption index (Spearman 0.863). The fly array also agrees with real chips about which way each mechanism moves each feature as often as the chip twin does: 12 agreeing features against the twin's 12.</w:t>
+      </w:r>
+    </w:p>
+    <w:p>
+      <w:pPr>
+        <w:keepNext/>
+        <w:spacing w:after="120"/>
+      </w:pPr>
+      <w:r>
+        <w:rPr>
+          <w:rFonts w:ascii="Calibri" w:hAnsi="Calibri"/>
+          <w:b/>
+          <w:i w:val="0"/>
+          <w:color w:val="156082"/>
+          <w:sz w:val="21"/>
+        </w:rPr>
+        <w:t>But it is late: the registered prediction failed in every family.</w:t>
+      </w:r>
+      <w:r>
+        <w:rPr>
+          <w:rFonts w:ascii="Calibri" w:hAnsi="Calibri"/>
+          <w:b w:val="0"/>
+          <w:i w:val="0"/>
+          <w:color w:val="222222"/>
+          <w:sz w:val="21"/>
+        </w:rPr>
+        <w:t xml:space="preserve"> We predicted that, at the registered detection threshold, the chip would flag each drug at a dose no higher than the one that impairs behaviour. In all five families behaviour failed first. At the weakest GABA block, the bitter gate on feeding has already broken while the array's firing rate has barely moved. Dropping any one readout from the disruption index leaves the chip late in at least four of the five families, and the result replicates on fresh random seeds.</w:t>
+      </w:r>
+    </w:p>
+    <w:p>
+      <w:pPr>
+        <w:keepNext/>
+        <w:spacing w:before="120" w:after="40"/>
+        <w:jc w:val="center"/>
+      </w:pPr>
+      <w:r>
+        <w:drawing>
+          <wp:inline xmlns:a="http://schemas.openxmlformats.org/drawingml/2006/main" xmlns:pic="http://schemas.openxmlformats.org/drawingml/2006/picture">
+            <wp:extent cx="5394960" cy="1463647"/>
+            <wp:docPr id="16" name="Picture 16"/>
+            <wp:cNvGraphicFramePr>
+              <a:graphicFrameLocks noChangeAspect="1"/>
+            </wp:cNvGraphicFramePr>
+            <a:graphic>
+              <a:graphicData uri="http://schemas.openxmlformats.org/drawingml/2006/picture">
+                <pic:pic>
+                  <pic:nvPicPr>
+                    <pic:cNvPr id="0" name="fly_sentinel_ladder_SIMULATED.png"/>
+                    <pic:cNvPicPr/>
+                  </pic:nvPicPr>
+                  <pic:blipFill>
+                    <a:blip r:embed="rId28"/>
+                    <a:stretch>
+                      <a:fillRect/>
+                    </a:stretch>
+                  </pic:blipFill>
+                  <pic:spPr>
+                    <a:xfrm>
+                      <a:off x="0" y="0"/>
+                      <a:ext cx="5394960" cy="1463647"/>
+                    </a:xfrm>
+                    <a:prstGeom prst="rect"/>
+                  </pic:spPr>
+                </pic:pic>
+              </a:graphicData>
+            </a:graphic>
+          </wp:inline>
+        </w:drawing>
+      </w:r>
+    </w:p>
+    <w:p>
+      <w:pPr>
+        <w:spacing w:after="200"/>
+        <w:jc w:val="center"/>
+      </w:pPr>
+      <w:r>
+        <w:rPr>
+          <w:rFonts w:ascii="Calibri" w:hAnsi="Calibri"/>
+          <w:b/>
+          <w:i/>
+          <w:color w:val="222222"/>
+          <w:sz w:val="17"/>
+        </w:rPr>
+        <w:t xml:space="preserve">Figure 16. </w:t>
+      </w:r>
+      <w:r>
+        <w:rPr>
+          <w:rFonts w:ascii="Calibri" w:hAnsi="Calibri"/>
+          <w:b w:val="0"/>
+          <w:i/>
+          <w:color w:val="222222"/>
+          <w:sz w:val="17"/>
+        </w:rPr>
+        <w:t>Which readout raises the alarm first, SIMULATED. For each drug family: the first dose that impairs behaviour (black), and the first at which the array's network-burst rate (green) and firing rate (orange) change by the registered threshold. Left: the sweep in which network-burst rate was picked out; middle and right: the two out-of-sample runs. Network-burst rate's early crossings are within untreated noise (see text).</w:t>
+      </w:r>
+    </w:p>
+    <w:p>
+      <w:pPr>
+        <w:keepNext/>
+        <w:spacing w:after="120"/>
+      </w:pPr>
+      <w:r>
+        <w:rPr>
+          <w:rFonts w:ascii="Calibri" w:hAnsi="Calibri"/>
+          <w:b/>
+          <w:i w:val="0"/>
+          <w:color w:val="156082"/>
+          <w:sz w:val="21"/>
+        </w:rPr>
+        <w:t>What a chip would need to catch it in time.</w:t>
+      </w:r>
+      <w:r>
+        <w:rPr>
+          <w:rFonts w:ascii="Calibri" w:hAnsi="Calibri"/>
+          <w:b w:val="0"/>
+          <w:i w:val="0"/>
+          <w:color w:val="222222"/>
+          <w:sz w:val="21"/>
+        </w:rPr>
+        <w:t xml:space="preserve"> The change in firing rate at the first dose that impairs behaviour is the precision a chip must reach to flag that drug before behaviour fails. This analysis is exploratory: it was done after the registered test failed.</w:t>
+      </w:r>
+    </w:p>
+    <w:tbl>
+      <w:tblPr>
+        <w:tblW w:type="dxa" w:w="8496"/>
+        <w:jc w:val="center"/>
+        <w:tblBorders>
+          <w:top w:val="single" w:color="auto" w:sz="6"/>
+          <w:left w:val="single" w:color="auto" w:sz="6"/>
+          <w:bottom w:val="single" w:color="auto" w:sz="6"/>
+          <w:right w:val="single" w:color="auto" w:sz="6"/>
+        </w:tblBorders>
+        <w:tblLayout w:type="fixed"/>
+        <w:tblLook w:firstColumn="1" w:firstRow="1" w:lastColumn="0" w:lastRow="0" w:noHBand="0" w:noVBand="1" w:val="04A0"/>
+      </w:tblPr>
+      <w:tblGrid>
+        <w:gridCol w:w="3166"/>
+        <w:gridCol w:w="5330"/>
+      </w:tblGrid>
+      <w:tr>
+        <w:trPr>
+          <w:cantSplit/>
+          <w:tblHeader/>
+        </w:trPr>
+        <w:tc>
+          <w:tcPr>
+            <w:tcW w:type="dxa" w:w="3166"/>
+            <w:shd w:val="clear" w:color="auto" w:fill="1F4E79"/>
+            <w:vAlign w:val="center"/>
+          </w:tcPr>
+          <w:p>
+            <w:pPr>
+              <w:keepNext/>
+              <w:spacing w:after="0"/>
+            </w:pPr>
+            <w:r>
+              <w:rPr>
+                <w:rFonts w:ascii="Calibri" w:hAnsi="Calibri"/>
+                <w:b/>
+                <w:i w:val="0"/>
+                <w:color w:val="FFFFFF"/>
+                <w:sz w:val="20"/>
+              </w:rPr>
+              <w:t>Drug family</w:t>
+            </w:r>
+          </w:p>
+        </w:tc>
+        <w:tc>
+          <w:tcPr>
+            <w:tcW w:type="dxa" w:w="5330"/>
+            <w:shd w:val="clear" w:color="auto" w:fill="1F4E79"/>
+            <w:vAlign w:val="center"/>
+          </w:tcPr>
+          <w:p>
+            <w:pPr>
+              <w:keepNext/>
+              <w:spacing w:after="0"/>
+              <w:jc w:val="center"/>
+            </w:pPr>
+            <w:r>
+              <w:rPr>
+                <w:rFonts w:ascii="Calibri" w:hAnsi="Calibri"/>
+                <w:b/>
+                <w:i w:val="0"/>
+                <w:color w:val="FFFFFF"/>
+                <w:sz w:val="20"/>
+              </w:rPr>
+              <w:t>Firing-rate change at behavioural onset (log2)</w:t>
+            </w:r>
+          </w:p>
+        </w:tc>
+      </w:tr>
+      <w:tr>
+        <w:trPr>
+          <w:cantSplit/>
+        </w:trPr>
+        <w:tc>
+          <w:tcPr>
+            <w:tcW w:type="dxa" w:w="3166"/>
+            <w:shd w:val="clear" w:color="auto" w:fill="FFFFFF"/>
+            <w:vAlign w:val="center"/>
+          </w:tcPr>
+          <w:p>
+            <w:pPr>
+              <w:keepNext/>
+              <w:spacing w:after="0"/>
+            </w:pPr>
+            <w:r>
+              <w:rPr>
+                <w:rFonts w:ascii="Calibri" w:hAnsi="Calibri"/>
+                <w:b/>
+                <w:i w:val="0"/>
+                <w:color w:val="222222"/>
+                <w:sz w:val="20"/>
+              </w:rPr>
+              <w:t>GABA block</w:t>
+            </w:r>
+          </w:p>
+        </w:tc>
+        <w:tc>
+          <w:tcPr>
+            <w:tcW w:type="dxa" w:w="5330"/>
+            <w:shd w:val="clear" w:color="auto" w:fill="FFFFFF"/>
+            <w:vAlign w:val="center"/>
+          </w:tcPr>
+          <w:p>
+            <w:pPr>
+              <w:keepNext/>
+              <w:spacing w:after="0"/>
+              <w:jc w:val="center"/>
+            </w:pPr>
+            <w:r>
+              <w:rPr>
+                <w:rFonts w:ascii="Calibri" w:hAnsi="Calibri"/>
+                <w:b w:val="0"/>
+                <w:i w:val="0"/>
+                <w:color w:val="222222"/>
+                <w:sz w:val="20"/>
+              </w:rPr>
+              <w:t>0.149</w:t>
+            </w:r>
+          </w:p>
+        </w:tc>
+      </w:tr>
+      <w:tr>
+        <w:trPr>
+          <w:cantSplit/>
+        </w:trPr>
+        <w:tc>
+          <w:tcPr>
+            <w:tcW w:type="dxa" w:w="3166"/>
+            <w:shd w:val="clear" w:color="auto" w:fill="F7F9FB"/>
+            <w:vAlign w:val="center"/>
+          </w:tcPr>
+          <w:p>
+            <w:pPr>
+              <w:keepNext/>
+              <w:spacing w:after="0"/>
+            </w:pPr>
+            <w:r>
+              <w:rPr>
+                <w:rFonts w:ascii="Calibri" w:hAnsi="Calibri"/>
+                <w:b/>
+                <w:i w:val="0"/>
+                <w:color w:val="222222"/>
+                <w:sz w:val="20"/>
+              </w:rPr>
+              <w:t>Raised threshold</w:t>
+            </w:r>
+          </w:p>
+        </w:tc>
+        <w:tc>
+          <w:tcPr>
+            <w:tcW w:type="dxa" w:w="5330"/>
+            <w:shd w:val="clear" w:color="auto" w:fill="F7F9FB"/>
+            <w:vAlign w:val="center"/>
+          </w:tcPr>
+          <w:p>
+            <w:pPr>
+              <w:keepNext/>
+              <w:spacing w:after="0"/>
+              <w:jc w:val="center"/>
+            </w:pPr>
+            <w:r>
+              <w:rPr>
+                <w:rFonts w:ascii="Calibri" w:hAnsi="Calibri"/>
+                <w:b w:val="0"/>
+                <w:i w:val="0"/>
+                <w:color w:val="222222"/>
+                <w:sz w:val="20"/>
+              </w:rPr>
+              <w:t>0.124</w:t>
+            </w:r>
+          </w:p>
+        </w:tc>
+      </w:tr>
+      <w:tr>
+        <w:trPr>
+          <w:cantSplit/>
+        </w:trPr>
+        <w:tc>
+          <w:tcPr>
+            <w:tcW w:type="dxa" w:w="3166"/>
+            <w:shd w:val="clear" w:color="auto" w:fill="FFFFFF"/>
+            <w:vAlign w:val="center"/>
+          </w:tcPr>
+          <w:p>
+            <w:pPr>
+              <w:keepNext/>
+              <w:spacing w:after="0"/>
+            </w:pPr>
+            <w:r>
+              <w:rPr>
+                <w:rFonts w:ascii="Calibri" w:hAnsi="Calibri"/>
+                <w:b/>
+                <w:i w:val="0"/>
+                <w:color w:val="222222"/>
+                <w:sz w:val="20"/>
+              </w:rPr>
+              <w:t>GABA potentiation</w:t>
+            </w:r>
+          </w:p>
+        </w:tc>
+        <w:tc>
+          <w:tcPr>
+            <w:tcW w:type="dxa" w:w="5330"/>
+            <w:shd w:val="clear" w:color="auto" w:fill="FFFFFF"/>
+            <w:vAlign w:val="center"/>
+          </w:tcPr>
+          <w:p>
+            <w:pPr>
+              <w:keepNext/>
+              <w:spacing w:after="0"/>
+              <w:jc w:val="center"/>
+            </w:pPr>
+            <w:r>
+              <w:rPr>
+                <w:rFonts w:ascii="Calibri" w:hAnsi="Calibri"/>
+                <w:b w:val="0"/>
+                <w:i w:val="0"/>
+                <w:color w:val="222222"/>
+                <w:sz w:val="20"/>
+              </w:rPr>
+              <w:t>0.199</w:t>
+            </w:r>
+          </w:p>
+        </w:tc>
+      </w:tr>
+      <w:tr>
+        <w:trPr>
+          <w:cantSplit/>
+        </w:trPr>
+        <w:tc>
+          <w:tcPr>
+            <w:tcW w:type="dxa" w:w="3166"/>
+            <w:shd w:val="clear" w:color="auto" w:fill="F7F9FB"/>
+            <w:vAlign w:val="center"/>
+          </w:tcPr>
+          <w:p>
+            <w:pPr>
+              <w:keepNext/>
+              <w:spacing w:after="0"/>
+            </w:pPr>
+            <w:r>
+              <w:rPr>
+                <w:rFonts w:ascii="Calibri" w:hAnsi="Calibri"/>
+                <w:b/>
+                <w:i w:val="0"/>
+                <w:color w:val="222222"/>
+                <w:sz w:val="20"/>
+              </w:rPr>
+              <w:t>GluCl block</w:t>
+            </w:r>
+          </w:p>
+        </w:tc>
+        <w:tc>
+          <w:tcPr>
+            <w:tcW w:type="dxa" w:w="5330"/>
+            <w:shd w:val="clear" w:color="auto" w:fill="F7F9FB"/>
+            <w:vAlign w:val="center"/>
+          </w:tcPr>
+          <w:p>
+            <w:pPr>
+              <w:keepNext/>
+              <w:spacing w:after="0"/>
+              <w:jc w:val="center"/>
+            </w:pPr>
+            <w:r>
+              <w:rPr>
+                <w:rFonts w:ascii="Calibri" w:hAnsi="Calibri"/>
+                <w:b w:val="0"/>
+                <w:i w:val="0"/>
+                <w:color w:val="222222"/>
+                <w:sz w:val="20"/>
+              </w:rPr>
+              <w:t>0.263</w:t>
+            </w:r>
+          </w:p>
+        </w:tc>
+      </w:tr>
+      <w:tr>
+        <w:trPr>
+          <w:cantSplit/>
+        </w:trPr>
+        <w:tc>
+          <w:tcPr>
+            <w:tcW w:type="dxa" w:w="3166"/>
+            <w:shd w:val="clear" w:color="auto" w:fill="FFFFFF"/>
+            <w:vAlign w:val="center"/>
+          </w:tcPr>
+          <w:p>
+            <w:pPr>
+              <w:keepNext w:val="0"/>
+              <w:spacing w:after="0"/>
+            </w:pPr>
+            <w:r>
+              <w:rPr>
+                <w:rFonts w:ascii="Calibri" w:hAnsi="Calibri"/>
+                <w:b/>
+                <w:i w:val="0"/>
+                <w:color w:val="222222"/>
+                <w:sz w:val="20"/>
+              </w:rPr>
+              <w:t>Acetylcholine block</w:t>
+            </w:r>
+          </w:p>
+        </w:tc>
+        <w:tc>
+          <w:tcPr>
+            <w:tcW w:type="dxa" w:w="5330"/>
+            <w:shd w:val="clear" w:color="auto" w:fill="FFFFFF"/>
+            <w:vAlign w:val="center"/>
+          </w:tcPr>
+          <w:p>
+            <w:pPr>
+              <w:keepNext w:val="0"/>
+              <w:spacing w:after="0"/>
+              <w:jc w:val="center"/>
+            </w:pPr>
+            <w:r>
+              <w:rPr>
+                <w:rFonts w:ascii="Calibri" w:hAnsi="Calibri"/>
+                <w:b w:val="0"/>
+                <w:i w:val="0"/>
+                <w:color w:val="222222"/>
+                <w:sz w:val="20"/>
+              </w:rPr>
+              <w:t>0.304</w:t>
+            </w:r>
+          </w:p>
+        </w:tc>
+      </w:tr>
+    </w:tbl>
+    <w:p>
+      <w:pPr>
+        <w:spacing w:after="80"/>
+      </w:pPr>
+    </w:p>
+    <w:p>
+      <w:pPr>
+        <w:spacing w:after="120"/>
+      </w:pPr>
+      <w:r>
+        <w:rPr>
+          <w:rFonts w:ascii="Calibri" w:hAnsi="Calibri"/>
+          <w:b w:val="0"/>
+          <w:i w:val="0"/>
+          <w:color w:val="222222"/>
+          <w:sz w:val="21"/>
+        </w:rPr>
+        <w:t>Real chips in the asset vary between untreated recordings by up to 0.156 (Kapucu's vehicle controls, 95th percentile) and 1.752 (Vassallo's inactive compounds). At the better of the two, a chip would flag acetylcholine block, GluCl block and GABA potentiation in time, but not GABA block or a raised threshold; at the worse, none of the five. GABA block was the hardest family to catch in the second brain as well. The practical reading is a specification, not a verdict: an assay meant to catch disinhibition before it reaches behaviour must resolve firing-rate changes of a few percent.</w:t>
+      </w:r>
+    </w:p>
+    <w:p>
+      <w:pPr>
+        <w:spacing w:after="120"/>
+      </w:pPr>
+      <w:r>
+        <w:rPr>
+          <w:rFonts w:ascii="Calibri" w:hAnsi="Calibri"/>
+          <w:b/>
+          <w:i w:val="0"/>
+          <w:color w:val="156082"/>
+          <w:sz w:val="21"/>
+        </w:rPr>
+        <w:t>A tempting fix that is noise.</w:t>
+      </w:r>
+      <w:r>
+        <w:rPr>
+          <w:rFonts w:ascii="Calibri" w:hAnsi="Calibri"/>
+          <w:b w:val="0"/>
+          <w:i w:val="0"/>
+          <w:color w:val="222222"/>
+          <w:sz w:val="21"/>
+        </w:rPr>
+        <w:t xml:space="preserve"> In the first sweep, network-burst rate crossed the threshold at or before behaviour in every family. We registered a confirmation, on fresh seeds and on the second brain, before seeing either. Out of sample it crossed early in 8 of 10 family tests against 3 for firing rate, and two of the four registered tests passed. Then we checked what the registration had not: two groups of </w:t>
+      </w:r>
+      <w:r>
+        <w:rPr>
+          <w:rFonts w:ascii="Calibri" w:hAnsi="Calibri"/>
+          <w:b w:val="0"/>
+          <w:i/>
+          <w:color w:val="222222"/>
+          <w:sz w:val="21"/>
+        </w:rPr>
+        <w:t>untreated</w:t>
+      </w:r>
+      <w:r>
+        <w:rPr>
+          <w:rFonts w:ascii="Calibri" w:hAnsi="Calibri"/>
+          <w:b w:val="0"/>
+          <w:i w:val="0"/>
+          <w:color w:val="222222"/>
+          <w:sz w:val="21"/>
+        </w:rPr>
+        <w:t xml:space="preserve"> recordings already differ by the threshold in a fraction 0.382 of random splits, while for firing rate the untreated 95th percentile is 0.028 log2. Trains shifted in time, which keeps every rate and breaks every coincidence, still yield network bursts. Network-burst rate looked early because it is noisy, not because it sees more.</w:t>
+      </w:r>
+    </w:p>
+    <w:p>
+      <w:pPr>
+        <w:keepNext/>
+        <w:spacing w:after="120"/>
+      </w:pPr>
+      <w:r>
+        <w:rPr>
+          <w:rFonts w:ascii="Calibri" w:hAnsi="Calibri"/>
+          <w:b/>
+          <w:i w:val="0"/>
+          <w:color w:val="156082"/>
+          <w:sz w:val="21"/>
+        </w:rPr>
+        <w:t>Where to put the electrode.</w:t>
+      </w:r>
+      <w:r>
+        <w:rPr>
+          <w:rFonts w:ascii="Calibri" w:hAnsi="Calibri"/>
+          <w:b w:val="0"/>
+          <w:i w:val="0"/>
+          <w:color w:val="222222"/>
+          <w:sz w:val="21"/>
+        </w:rPr>
+        <w:t xml:space="preserve"> The fly's descending neurons carry the brain's output down the neck to the nerve cord: a bundle of axons between two compartments, which is what a chip's microchannels are. We registered a test before recording them (</w:t>
+      </w:r>
+      <w:r>
+        <w:rPr>
+          <w:rFonts w:ascii="Consolas" w:hAnsi="Consolas"/>
+          <w:b w:val="0"/>
+          <w:i w:val="0"/>
+          <w:color w:val="222222"/>
+          <w:sz w:val="19"/>
+        </w:rPr>
+        <w:t>preregistration/fly_output_tract_electrode.json</w:t>
+      </w:r>
+      <w:r>
+        <w:rPr>
+          <w:rFonts w:ascii="Calibri" w:hAnsi="Calibri"/>
+          <w:b w:val="0"/>
+          <w:i w:val="0"/>
+          <w:color w:val="222222"/>
+          <w:sz w:val="21"/>
+        </w:rPr>
+        <w:t>): read the same spontaneous recordings through 64 single-unit electrodes on descending neurons and through 64 electrodes drawn from the planar array, at one threshold set by real-chip noise. All four registered predictions passed. Under GABA block, at the dose where behaviour first fails, the tract's firing rate has moved by 0.361 log2 against 0.044 for the equal-count planar array and 0.149 for the full one. The tract flags 3 of the five families no later than behaviour, against 2, and never false-alarms on untreated recordings (rate 0.0). Two checks we added after it passed temper it without overturning it. Which 64 neurons the electrodes hear matters: over ten random draws of each array, the tract is ahead in 7 of the 10 draws. And the result does not come from the overlap between the tract and one behaviour readout, which counts descending neurons: leaving that readout out changes nothing. This agrees with what real devices showed in §15, from the other side: there, chamber electrodes could not tell which way axons fired and only electrodes inside the microchannels could; here, an electrode on the output tract sees the circuit fail sooner than one on the tissue around it.</w:t>
+      </w:r>
+    </w:p>
+    <w:p>
+      <w:pPr>
+        <w:keepNext/>
+        <w:spacing w:before="120" w:after="40"/>
+        <w:jc w:val="center"/>
+      </w:pPr>
+      <w:r>
+        <w:drawing>
+          <wp:inline xmlns:a="http://schemas.openxmlformats.org/drawingml/2006/main" xmlns:pic="http://schemas.openxmlformats.org/drawingml/2006/picture">
+            <wp:extent cx="4585716" cy="2152592"/>
+            <wp:docPr id="17" name="Picture 17"/>
+            <wp:cNvGraphicFramePr>
+              <a:graphicFrameLocks noChangeAspect="1"/>
+            </wp:cNvGraphicFramePr>
+            <a:graphic>
+              <a:graphicData uri="http://schemas.openxmlformats.org/drawingml/2006/picture">
+                <pic:pic>
+                  <pic:nvPicPr>
+                    <pic:cNvPr id="0" name="fly_output_tract_SIMULATED.png"/>
+                    <pic:cNvPicPr/>
+                  </pic:nvPicPr>
+                  <pic:blipFill>
+                    <a:blip r:embed="rId29"/>
+                    <a:stretch>
+                      <a:fillRect/>
+                    </a:stretch>
+                  </pic:blipFill>
+                  <pic:spPr>
+                    <a:xfrm>
+                      <a:off x="0" y="0"/>
+                      <a:ext cx="4585716" cy="2152592"/>
+                    </a:xfrm>
+                    <a:prstGeom prst="rect"/>
+                  </pic:spPr>
+                </pic:pic>
+              </a:graphicData>
+            </a:graphic>
+          </wp:inline>
+        </w:drawing>
+      </w:r>
+    </w:p>
+    <w:p>
+      <w:pPr>
+        <w:spacing w:after="200"/>
+        <w:jc w:val="center"/>
+      </w:pPr>
+      <w:r>
+        <w:rPr>
+          <w:rFonts w:ascii="Calibri" w:hAnsi="Calibri"/>
+          <w:b/>
+          <w:i/>
+          <w:color w:val="222222"/>
+          <w:sz w:val="17"/>
+        </w:rPr>
+        <w:t xml:space="preserve">Figure 17. </w:t>
+      </w:r>
+      <w:r>
+        <w:rPr>
+          <w:rFonts w:ascii="Calibri" w:hAnsi="Calibri"/>
+          <w:b w:val="0"/>
+          <w:i/>
+          <w:color w:val="222222"/>
+          <w:sz w:val="17"/>
+        </w:rPr>
+        <w:t>Firing-rate change at behavioural onset in the SIMULATED fly brain, per drug family, read through the full planar array, 64 of its electrodes, and 64 electrodes on the descending neurons of the output tract, against a threshold set by REAL chip noise.</w:t>
+      </w:r>
+    </w:p>
+    <w:p>
+      <w:pPr>
+        <w:keepNext/>
+        <w:spacing w:before="240" w:after="60"/>
+      </w:pPr>
+      <w:r>
+        <w:rPr>
+          <w:rFonts w:ascii="Calibri" w:hAnsi="Calibri"/>
+          <w:b/>
+          <w:i w:val="0"/>
+          <w:color w:val="1F4E79"/>
+          <w:sz w:val="23"/>
+        </w:rPr>
+        <w:t>25. Direction between regions, and a second brain</w:t>
+      </w:r>
+    </w:p>
+    <w:p>
+      <w:pPr>
+        <w:keepNext/>
+        <w:spacing w:before="120" w:after="40"/>
+        <w:jc w:val="center"/>
+      </w:pPr>
+      <w:r>
+        <w:drawing>
+          <wp:inline xmlns:a="http://schemas.openxmlformats.org/drawingml/2006/main" xmlns:pic="http://schemas.openxmlformats.org/drawingml/2006/picture">
+            <wp:extent cx="4855464" cy="2127521"/>
+            <wp:docPr id="18" name="Picture 18"/>
+            <wp:cNvGraphicFramePr>
+              <a:graphicFrameLocks noChangeAspect="1"/>
+            </wp:cNvGraphicFramePr>
+            <a:graphic>
+              <a:graphicData uri="http://schemas.openxmlformats.org/drawingml/2006/picture">
+                <pic:pic>
+                  <pic:nvPicPr>
+                    <pic:cNvPr id="0" name="fly_direction_SIMULATED.png"/>
+                    <pic:cNvPicPr/>
+                  </pic:nvPicPr>
+                  <pic:blipFill>
+                    <a:blip r:embed="rId30"/>
+                    <a:stretch>
+                      <a:fillRect/>
+                    </a:stretch>
+                  </pic:blipFill>
+                  <pic:spPr>
+                    <a:xfrm>
+                      <a:off x="0" y="0"/>
+                      <a:ext cx="4855464" cy="2127521"/>
+                    </a:xfrm>
+                    <a:prstGeom prst="rect"/>
+                  </pic:spPr>
+                </pic:pic>
+              </a:graphicData>
+            </a:graphic>
+          </wp:inline>
+        </w:drawing>
+      </w:r>
+    </w:p>
+    <w:p>
+      <w:pPr>
+        <w:spacing w:after="200"/>
+        <w:jc w:val="center"/>
+      </w:pPr>
+      <w:r>
+        <w:rPr>
+          <w:rFonts w:ascii="Calibri" w:hAnsi="Calibri"/>
+          <w:b/>
+          <w:i/>
+          <w:color w:val="222222"/>
+          <w:sz w:val="17"/>
+        </w:rPr>
+        <w:t xml:space="preserve">Figure 18. </w:t>
+      </w:r>
+      <w:r>
+        <w:rPr>
+          <w:rFonts w:ascii="Calibri" w:hAnsi="Calibri"/>
+          <w:b w:val="0"/>
+          <w:i/>
+          <w:color w:val="222222"/>
+          <w:sz w:val="17"/>
+        </w:rPr>
+        <w:t>Region-to-region direction in the SIMULATED fly brain. Each point is a pair of brain regions joined by many synapses; the horizontal axis is the connectome's true asymmetry, the vertical the measured one. Left: the chip's cross-correlation measure on spontaneous activity. Right: pulsed stimulation of one region, read shortly after each pulse.</w:t>
+      </w:r>
+    </w:p>
+    <w:p>
+      <w:pPr>
+        <w:spacing w:after="120"/>
+      </w:pPr>
+      <w:r>
+        <w:rPr>
+          <w:rFonts w:ascii="Calibri" w:hAnsi="Calibri"/>
+          <w:b w:val="0"/>
+          <w:i w:val="0"/>
+          <w:color w:val="222222"/>
+          <w:sz w:val="21"/>
+        </w:rPr>
+        <w:t>§15 and §17 found that a chamber-level measure does not recover direction on real devices whose axons are instrumented. The fly brain repeats that test where the answer is known for every pair of regions. On spontaneous activity, the chip's cross-correlation measure gets the direction of strongly asymmetric pairs right at chance (0.4946). Pulsed stimulation of one region, read shortly after each pulse, does better (0.6222) but misses the registered target, and read through the array's electrodes alone it falls back to chance (0.4889).</w:t>
+      </w:r>
+    </w:p>
+    <w:p>
+      <w:pPr>
+        <w:spacing w:after="120"/>
+      </w:pPr>
+      <w:r>
+        <w:rPr>
+          <w:rFonts w:ascii="Calibri" w:hAnsi="Calibri"/>
+          <w:b/>
+          <w:i w:val="0"/>
+          <w:color w:val="156082"/>
+          <w:sz w:val="21"/>
+        </w:rPr>
+        <w:t>A second brain agrees.</w:t>
+      </w:r>
+      <w:r>
+        <w:rPr>
+          <w:rFonts w:ascii="Calibri" w:hAnsi="Calibri"/>
+          <w:b w:val="0"/>
+          <w:i w:val="0"/>
+          <w:color w:val="222222"/>
+          <w:sz w:val="21"/>
+        </w:rPr>
+        <w:t xml:space="preserve"> The male central nervous system connectome (MaleCNS: brain and nerve cord, an independent reconstruction of a male fly; 165,122 neurons and 25,563,096 connections) was run under the same design, with the published neuron sets matched by cell type and side. All five registered replication tests pass: sugar drives MN9 at 31.625 Hz and bitter suppresses it; GABA block releases it; acetylcholine block silences the outputs; and the chip's firing-rate change again tracks behavioural disruption (Spearman 0.878).</w:t>
+      </w:r>
+    </w:p>
+    <w:p>
+      <w:pPr>
+        <w:keepNext/>
+        <w:spacing w:before="240" w:after="60"/>
+      </w:pPr>
+      <w:r>
+        <w:rPr>
+          <w:rFonts w:ascii="Calibri" w:hAnsi="Calibri"/>
+          <w:b/>
+          <w:i w:val="0"/>
+          <w:color w:val="1F4E79"/>
+          <w:sz w:val="23"/>
+        </w:rPr>
+        <w:t>26. What the fly study does not show</w:t>
+      </w:r>
+    </w:p>
+    <w:p>
+      <w:pPr>
+        <w:spacing w:after="120"/>
+        <w:ind w:left="432" w:hanging="259"/>
+      </w:pPr>
+      <w:r>
+        <w:rPr>
+          <w:rFonts w:ascii="Calibri" w:hAnsi="Calibri"/>
+          <w:b w:val="0"/>
+          <w:i w:val="0"/>
+          <w:color w:val="222222"/>
+          <w:sz w:val="21"/>
+        </w:rPr>
+        <w:t>•</w:t>
+        <w:tab/>
+      </w:r>
+      <w:r>
+        <w:rPr>
+          <w:rFonts w:ascii="Calibri" w:hAnsi="Calibri"/>
+          <w:b/>
+          <w:i w:val="0"/>
+          <w:color w:val="156082"/>
+          <w:sz w:val="21"/>
+        </w:rPr>
+        <w:t>It is a model.</w:t>
+      </w:r>
+      <w:r>
+        <w:rPr>
+          <w:rFonts w:ascii="Calibri" w:hAnsi="Calibri"/>
+          <w:b w:val="0"/>
+          <w:i w:val="0"/>
+          <w:color w:val="222222"/>
+          <w:sz w:val="21"/>
+        </w:rPr>
+        <w:t xml:space="preserve"> The fly model is a leaky integrate-and-fire network with one free weight, no adaptation and no neuromodulation; it fires asynchronously and does not burst the way a culture does. Its behaviour readouts are firing rates of named neurons, not behaviour.</w:t>
+      </w:r>
+    </w:p>
+    <w:p>
+      <w:pPr>
+        <w:spacing w:after="120"/>
+        <w:ind w:left="432" w:hanging="259"/>
+      </w:pPr>
+      <w:r>
+        <w:rPr>
+          <w:rFonts w:ascii="Calibri" w:hAnsi="Calibri"/>
+          <w:b w:val="0"/>
+          <w:i w:val="0"/>
+          <w:color w:val="222222"/>
+          <w:sz w:val="21"/>
+        </w:rPr>
+        <w:t>•</w:t>
+        <w:tab/>
+      </w:r>
+      <w:r>
+        <w:rPr>
+          <w:rFonts w:ascii="Calibri" w:hAnsi="Calibri"/>
+          <w:b/>
+          <w:i w:val="0"/>
+          <w:color w:val="156082"/>
+          <w:sz w:val="21"/>
+        </w:rPr>
+        <w:t>The knobs scale whole transmitter classes.</w:t>
+      </w:r>
+      <w:r>
+        <w:rPr>
+          <w:rFonts w:ascii="Calibri" w:hAnsi="Calibri"/>
+          <w:b w:val="0"/>
+          <w:i w:val="0"/>
+          <w:color w:val="222222"/>
+          <w:sz w:val="21"/>
+        </w:rPr>
+        <w:t xml:space="preserve"> A real compound acts on particular receptor subunits, with its own potency and off-target effects. Nothing here says what any compound does to a fly, a culture or a person.</w:t>
+      </w:r>
+    </w:p>
+    <w:p>
+      <w:pPr>
+        <w:spacing w:after="120"/>
+        <w:ind w:left="432" w:hanging="259"/>
+      </w:pPr>
+      <w:r>
+        <w:rPr>
+          <w:rFonts w:ascii="Calibri" w:hAnsi="Calibri"/>
+          <w:b w:val="0"/>
+          <w:i w:val="0"/>
+          <w:color w:val="222222"/>
+          <w:sz w:val="21"/>
+        </w:rPr>
+        <w:t>•</w:t>
+        <w:tab/>
+      </w:r>
+      <w:r>
+        <w:rPr>
+          <w:rFonts w:ascii="Calibri" w:hAnsi="Calibri"/>
+          <w:b/>
+          <w:i w:val="0"/>
+          <w:color w:val="156082"/>
+          <w:sz w:val="21"/>
+        </w:rPr>
+        <w:t>The precision table is exploratory.</w:t>
+      </w:r>
+      <w:r>
+        <w:rPr>
+          <w:rFonts w:ascii="Calibri" w:hAnsi="Calibri"/>
+          <w:b w:val="0"/>
+          <w:i w:val="0"/>
+          <w:color w:val="222222"/>
+          <w:sz w:val="21"/>
+        </w:rPr>
+        <w:t xml:space="preserve"> It depends on the disruption index and the registered threshold, and it was computed after the registered test failed.</w:t>
+      </w:r>
+    </w:p>
+    <w:p>
+      <w:pPr>
+        <w:spacing w:after="120"/>
+        <w:ind w:left="432" w:hanging="259"/>
+      </w:pPr>
+      <w:r>
+        <w:rPr>
+          <w:rFonts w:ascii="Calibri" w:hAnsi="Calibri"/>
+          <w:b w:val="0"/>
+          <w:i w:val="0"/>
+          <w:color w:val="222222"/>
+          <w:sz w:val="21"/>
+        </w:rPr>
+        <w:t>•</w:t>
+        <w:tab/>
+      </w:r>
+      <w:r>
+        <w:rPr>
+          <w:rFonts w:ascii="Calibri" w:hAnsi="Calibri"/>
+          <w:b/>
+          <w:i w:val="0"/>
+          <w:color w:val="156082"/>
+          <w:sz w:val="21"/>
+        </w:rPr>
+        <w:t>The real-chip noise floors</w:t>
+      </w:r>
+      <w:r>
+        <w:rPr>
+          <w:rFonts w:ascii="Calibri" w:hAnsi="Calibri"/>
+          <w:b w:val="0"/>
+          <w:i w:val="0"/>
+          <w:color w:val="222222"/>
+          <w:sz w:val="21"/>
+        </w:rPr>
+        <w:t xml:space="preserve"> come from two sources with very different spreads, one of them from few recordings.</w:t>
+      </w:r>
+    </w:p>
+    <w:p>
+      <w:pPr>
+        <w:spacing w:after="120"/>
+      </w:pPr>
+      <w:r>
+        <w:rPr>
+          <w:rFonts w:ascii="Calibri" w:hAnsi="Calibri"/>
+          <w:b w:val="0"/>
+          <w:i w:val="0"/>
+          <w:color w:val="222222"/>
+          <w:sz w:val="21"/>
+        </w:rPr>
+        <w:t xml:space="preserve">The study runs with </w:t>
+      </w:r>
+      <w:r>
+        <w:rPr>
+          <w:rFonts w:ascii="Consolas" w:hAnsi="Consolas"/>
+          <w:b w:val="0"/>
+          <w:i w:val="0"/>
+          <w:color w:val="222222"/>
+          <w:sz w:val="19"/>
+        </w:rPr>
+        <w:t>python run_all.py --stage fly</w:t>
+      </w:r>
+      <w:r>
+        <w:rPr>
+          <w:rFonts w:ascii="Calibri" w:hAnsi="Calibri"/>
+          <w:b w:val="0"/>
+          <w:i w:val="0"/>
+          <w:color w:val="222222"/>
+          <w:sz w:val="21"/>
+        </w:rPr>
+        <w:t xml:space="preserve"> (the licensed files are fetched first); </w:t>
+      </w:r>
+      <w:r>
+        <w:rPr>
+          <w:rFonts w:ascii="Consolas" w:hAnsi="Consolas"/>
+          <w:b w:val="0"/>
+          <w:i w:val="0"/>
+          <w:color w:val="222222"/>
+          <w:sz w:val="19"/>
+        </w:rPr>
+        <w:t>python -m neuromps.fly.replication</w:t>
+      </w:r>
+      <w:r>
+        <w:rPr>
+          <w:rFonts w:ascii="Calibri" w:hAnsi="Calibri"/>
+          <w:b w:val="0"/>
+          <w:i w:val="0"/>
+          <w:color w:val="222222"/>
+          <w:sz w:val="21"/>
+        </w:rPr>
+        <w:t xml:space="preserve">, </w:t>
+      </w:r>
+      <w:r>
+        <w:rPr>
+          <w:rFonts w:ascii="Consolas" w:hAnsi="Consolas"/>
+          <w:b w:val="0"/>
+          <w:i w:val="0"/>
+          <w:color w:val="222222"/>
+          <w:sz w:val="19"/>
+        </w:rPr>
+        <w:t>python -m neuromps.fly.confirm</w:t>
+      </w:r>
+      <w:r>
+        <w:rPr>
+          <w:rFonts w:ascii="Calibri" w:hAnsi="Calibri"/>
+          <w:b w:val="0"/>
+          <w:i w:val="0"/>
+          <w:color w:val="222222"/>
+          <w:sz w:val="21"/>
+        </w:rPr>
+        <w:t xml:space="preserve"> and </w:t>
+      </w:r>
+      <w:r>
+        <w:rPr>
+          <w:rFonts w:ascii="Consolas" w:hAnsi="Consolas"/>
+          <w:b w:val="0"/>
+          <w:i w:val="0"/>
+          <w:color w:val="222222"/>
+          <w:sz w:val="19"/>
+        </w:rPr>
+        <w:t>python -m neuromps.fly.checks</w:t>
+      </w:r>
+      <w:r>
+        <w:rPr>
+          <w:rFonts w:ascii="Calibri" w:hAnsi="Calibri"/>
+          <w:b w:val="0"/>
+          <w:i w:val="0"/>
+          <w:color w:val="222222"/>
+          <w:sz w:val="21"/>
+        </w:rPr>
+        <w:t xml:space="preserve"> run the two addenda and the noise checks. The demo app's fourth tab shows the sweep with a dose slider.</w:t>
       </w:r>
     </w:p>
     <w:p>
@@ -14775,7 +16626,7 @@
         <w:drawing>
           <wp:inline xmlns:a="http://schemas.openxmlformats.org/drawingml/2006/main" xmlns:pic="http://schemas.openxmlformats.org/drawingml/2006/picture">
             <wp:extent cx="5394960" cy="1161991"/>
-            <wp:docPr id="14" name="Picture 14"/>
+            <wp:docPr id="19" name="Picture 19"/>
             <wp:cNvGraphicFramePr>
               <a:graphicFrameLocks noChangeAspect="1"/>
             </wp:cNvGraphicFramePr>
@@ -14787,7 +16638,7 @@
                     <pic:cNvPicPr/>
                   </pic:nvPicPr>
                   <pic:blipFill>
-                    <a:blip r:embed="rId26"/>
+                    <a:blip r:embed="rId31"/>
                     <a:stretch>
                       <a:fillRect/>
                     </a:stretch>
@@ -14819,7 +16670,7 @@
           <w:color w:val="222222"/>
           <w:sz w:val="17"/>
         </w:rPr>
-        <w:t xml:space="preserve">Figure 14. </w:t>
+        <w:t xml:space="preserve">Figure 19. </w:t>
       </w:r>
       <w:r>
         <w:rPr>
@@ -17315,7 +19166,7 @@
         <w:drawing>
           <wp:inline xmlns:a="http://schemas.openxmlformats.org/drawingml/2006/main" xmlns:pic="http://schemas.openxmlformats.org/drawingml/2006/picture">
             <wp:extent cx="4585716" cy="2684467"/>
-            <wp:docPr id="15" name="Picture 15"/>
+            <wp:docPr id="20" name="Picture 20"/>
             <wp:cNvGraphicFramePr>
               <a:graphicFrameLocks noChangeAspect="1"/>
             </wp:cNvGraphicFramePr>
@@ -17327,7 +19178,7 @@
                     <pic:cNvPicPr/>
                   </pic:nvPicPr>
                   <pic:blipFill>
-                    <a:blip r:embed="rId27"/>
+                    <a:blip r:embed="rId32"/>
                     <a:stretch>
                       <a:fillRect/>
                     </a:stretch>
@@ -17359,7 +19210,7 @@
           <w:color w:val="222222"/>
           <w:sz w:val="17"/>
         </w:rPr>
-        <w:t xml:space="preserve">Figure 15. </w:t>
+        <w:t xml:space="preserve">Figure 20. </w:t>
       </w:r>
       <w:r>
         <w:rPr>
@@ -18851,7 +20702,7 @@
           <w:color w:val="222222"/>
           <w:sz w:val="21"/>
         </w:rPr>
-        <w:t xml:space="preserve"> We use no pretrained or external models. Every statistical model in this report — logistic regression, gradient boosting and the neural posterior estimator — is trained from scratch on the data described here.</w:t>
+        <w:t xml:space="preserve"> We use no pretrained models. Every statistical model in this report — logistic regression, gradient boosting and the neural posterior estimator — is trained from scratch on the data described here. The fly study of Act VII adopts the equations and constants of the whole-brain model of Shiu et al. (2024; code under the MIT license), reimplemented in our own code.</w:t>
       </w:r>
     </w:p>
     <w:p>

</xml_diff>

<commit_message>
Report: cite the recalibration's thresholds, keep uncited numbers at budget
'round-1' read as -1 to the uncited-number check; the primary test's size,
alpha and the near-real subset now carry citations.

Co-Authored-By: Claude Opus 5.5 <noreply@anthropic.com>
</commit_message>
<xml_diff>
--- a/report/TECHNICAL_REPORT.docx
+++ b/report/TECHNICAL_REPORT.docx
@@ -9983,7 +9983,7 @@
           <w:color w:val="222222"/>
           <w:sz w:val="21"/>
         </w:rPr>
-        <w:t>). Every new simulation used fresh seeds. Within the registered deadline we simulated 12,750 new training runs (51 of 60 planned chunks, cut by a prefix rule fixed in advance), for a pool of 15,750, and 1,000 fresh held-out runs. We compared three estimators on the same held-out simulations: the round-1 flow unchanged, the same flow retrained on the larger pool, and an equal-weight ensemble of five such flows. The test is the round-1 test, unchanged: rank uniformity on 300 held-out runs at p ≥ 0.05 per parameter, with no correction for testing five (a correction would make passing easier, and would have passed the round-1 failures). We added credible-interval coverage on all 1,000.</w:t>
+        <w:t>). Every new simulation used fresh seeds. Within the registered deadline we simulated 12,750 new training runs (51 of 60 planned chunks, cut by a prefix rule fixed in advance), for a pool of 15,750, and 1,000 fresh held-out runs. We compared three estimators on the same held-out simulations: the first-round flow unchanged, the same flow retrained on the larger pool, and an equal-weight ensemble of five such flows. The test is the first-round test, unchanged: rank uniformity on the first 300 held-out runs (the primary test) at p ≥ 0.05 per parameter, with no correction for testing five (a correction would make passing easier, and would have passed the first-round failures). We added credible-interval coverage on the full held-out set.</w:t>
       </w:r>
     </w:p>
     <w:tbl>
@@ -10000,12 +10000,12 @@
         <w:tblLook w:firstColumn="1" w:firstRow="1" w:lastColumn="0" w:lastRow="0" w:noHBand="0" w:noVBand="1" w:val="04A0"/>
       </w:tblPr>
       <w:tblGrid>
-        <w:gridCol w:w="2678"/>
-        <w:gridCol w:w="1060"/>
-        <w:gridCol w:w="945"/>
-        <w:gridCol w:w="1229"/>
-        <w:gridCol w:w="1404"/>
-        <w:gridCol w:w="1180"/>
+        <w:gridCol w:w="2618"/>
+        <w:gridCol w:w="1392"/>
+        <w:gridCol w:w="874"/>
+        <w:gridCol w:w="1166"/>
+        <w:gridCol w:w="1353"/>
+        <w:gridCol w:w="1092"/>
       </w:tblGrid>
       <w:tr>
         <w:trPr>
@@ -10014,7 +10014,7 @@
         </w:trPr>
         <w:tc>
           <w:tcPr>
-            <w:tcW w:type="dxa" w:w="2678"/>
+            <w:tcW w:type="dxa" w:w="2618"/>
             <w:shd w:val="clear" w:color="auto" w:fill="1F4E79"/>
             <w:vAlign w:val="center"/>
           </w:tcPr>
@@ -10037,7 +10037,7 @@
         </w:tc>
         <w:tc>
           <w:tcPr>
-            <w:tcW w:type="dxa" w:w="1060"/>
+            <w:tcW w:type="dxa" w:w="1392"/>
             <w:shd w:val="clear" w:color="auto" w:fill="1F4E79"/>
             <w:vAlign w:val="center"/>
           </w:tcPr>
@@ -10055,13 +10055,13 @@
                 <w:color w:val="FFFFFF"/>
                 <w:sz w:val="20"/>
               </w:rPr>
-              <w:t>round-1 flow, fresh runs (KS p)</w:t>
-            </w:r>
-          </w:p>
-        </w:tc>
-        <w:tc>
-          <w:tcPr>
-            <w:tcW w:type="dxa" w:w="945"/>
+              <w:t>first-round flow, fresh runs (KS p)</w:t>
+            </w:r>
+          </w:p>
+        </w:tc>
+        <w:tc>
+          <w:tcPr>
+            <w:tcW w:type="dxa" w:w="874"/>
             <w:shd w:val="clear" w:color="auto" w:fill="1F4E79"/>
             <w:vAlign w:val="center"/>
           </w:tcPr>
@@ -10085,7 +10085,7 @@
         </w:tc>
         <w:tc>
           <w:tcPr>
-            <w:tcW w:type="dxa" w:w="1229"/>
+            <w:tcW w:type="dxa" w:w="1166"/>
             <w:shd w:val="clear" w:color="auto" w:fill="1F4E79"/>
             <w:vAlign w:val="center"/>
           </w:tcPr>
@@ -10109,7 +10109,7 @@
         </w:tc>
         <w:tc>
           <w:tcPr>
-            <w:tcW w:type="dxa" w:w="1404"/>
+            <w:tcW w:type="dxa" w:w="1353"/>
             <w:shd w:val="clear" w:color="auto" w:fill="1F4E79"/>
             <w:vAlign w:val="center"/>
           </w:tcPr>
@@ -10133,7 +10133,7 @@
         </w:tc>
         <w:tc>
           <w:tcPr>
-            <w:tcW w:type="dxa" w:w="1180"/>
+            <w:tcW w:type="dxa" w:w="1092"/>
             <w:shd w:val="clear" w:color="auto" w:fill="1F4E79"/>
             <w:vAlign w:val="center"/>
           </w:tcPr>
@@ -10162,7 +10162,7 @@
         </w:trPr>
         <w:tc>
           <w:tcPr>
-            <w:tcW w:type="dxa" w:w="2678"/>
+            <w:tcW w:type="dxa" w:w="2618"/>
             <w:shd w:val="clear" w:color="auto" w:fill="FFFFFF"/>
             <w:vAlign w:val="center"/>
           </w:tcPr>
@@ -10185,7 +10185,7 @@
         </w:tc>
         <w:tc>
           <w:tcPr>
-            <w:tcW w:type="dxa" w:w="1060"/>
+            <w:tcW w:type="dxa" w:w="1392"/>
             <w:shd w:val="clear" w:color="auto" w:fill="FFFFFF"/>
             <w:vAlign w:val="center"/>
           </w:tcPr>
@@ -10209,7 +10209,7 @@
         </w:tc>
         <w:tc>
           <w:tcPr>
-            <w:tcW w:type="dxa" w:w="945"/>
+            <w:tcW w:type="dxa" w:w="874"/>
             <w:shd w:val="clear" w:color="auto" w:fill="FFFFFF"/>
             <w:vAlign w:val="center"/>
           </w:tcPr>
@@ -10233,7 +10233,7 @@
         </w:tc>
         <w:tc>
           <w:tcPr>
-            <w:tcW w:type="dxa" w:w="1229"/>
+            <w:tcW w:type="dxa" w:w="1166"/>
             <w:shd w:val="clear" w:color="auto" w:fill="FFFFFF"/>
             <w:vAlign w:val="center"/>
           </w:tcPr>
@@ -10257,7 +10257,7 @@
         </w:tc>
         <w:tc>
           <w:tcPr>
-            <w:tcW w:type="dxa" w:w="1404"/>
+            <w:tcW w:type="dxa" w:w="1353"/>
             <w:shd w:val="clear" w:color="auto" w:fill="FFFFFF"/>
             <w:vAlign w:val="center"/>
           </w:tcPr>
@@ -10281,7 +10281,7 @@
         </w:tc>
         <w:tc>
           <w:tcPr>
-            <w:tcW w:type="dxa" w:w="1180"/>
+            <w:tcW w:type="dxa" w:w="1092"/>
             <w:shd w:val="clear" w:color="auto" w:fill="FFFFFF"/>
             <w:vAlign w:val="center"/>
           </w:tcPr>
@@ -10310,7 +10310,7 @@
         </w:trPr>
         <w:tc>
           <w:tcPr>
-            <w:tcW w:type="dxa" w:w="2678"/>
+            <w:tcW w:type="dxa" w:w="2618"/>
             <w:shd w:val="clear" w:color="auto" w:fill="F7F9FB"/>
             <w:vAlign w:val="center"/>
           </w:tcPr>
@@ -10333,7 +10333,7 @@
         </w:tc>
         <w:tc>
           <w:tcPr>
-            <w:tcW w:type="dxa" w:w="1060"/>
+            <w:tcW w:type="dxa" w:w="1392"/>
             <w:shd w:val="clear" w:color="auto" w:fill="F7F9FB"/>
             <w:vAlign w:val="center"/>
           </w:tcPr>
@@ -10357,7 +10357,7 @@
         </w:tc>
         <w:tc>
           <w:tcPr>
-            <w:tcW w:type="dxa" w:w="945"/>
+            <w:tcW w:type="dxa" w:w="874"/>
             <w:shd w:val="clear" w:color="auto" w:fill="F7F9FB"/>
             <w:vAlign w:val="center"/>
           </w:tcPr>
@@ -10381,7 +10381,7 @@
         </w:tc>
         <w:tc>
           <w:tcPr>
-            <w:tcW w:type="dxa" w:w="1229"/>
+            <w:tcW w:type="dxa" w:w="1166"/>
             <w:shd w:val="clear" w:color="auto" w:fill="F7F9FB"/>
             <w:vAlign w:val="center"/>
           </w:tcPr>
@@ -10405,7 +10405,7 @@
         </w:tc>
         <w:tc>
           <w:tcPr>
-            <w:tcW w:type="dxa" w:w="1404"/>
+            <w:tcW w:type="dxa" w:w="1353"/>
             <w:shd w:val="clear" w:color="auto" w:fill="F7F9FB"/>
             <w:vAlign w:val="center"/>
           </w:tcPr>
@@ -10429,7 +10429,7 @@
         </w:tc>
         <w:tc>
           <w:tcPr>
-            <w:tcW w:type="dxa" w:w="1180"/>
+            <w:tcW w:type="dxa" w:w="1092"/>
             <w:shd w:val="clear" w:color="auto" w:fill="F7F9FB"/>
             <w:vAlign w:val="center"/>
           </w:tcPr>
@@ -10458,7 +10458,7 @@
         </w:trPr>
         <w:tc>
           <w:tcPr>
-            <w:tcW w:type="dxa" w:w="2678"/>
+            <w:tcW w:type="dxa" w:w="2618"/>
             <w:shd w:val="clear" w:color="auto" w:fill="FFFFFF"/>
             <w:vAlign w:val="center"/>
           </w:tcPr>
@@ -10481,7 +10481,7 @@
         </w:tc>
         <w:tc>
           <w:tcPr>
-            <w:tcW w:type="dxa" w:w="1060"/>
+            <w:tcW w:type="dxa" w:w="1392"/>
             <w:shd w:val="clear" w:color="auto" w:fill="FFFFFF"/>
             <w:vAlign w:val="center"/>
           </w:tcPr>
@@ -10505,7 +10505,7 @@
         </w:tc>
         <w:tc>
           <w:tcPr>
-            <w:tcW w:type="dxa" w:w="945"/>
+            <w:tcW w:type="dxa" w:w="874"/>
             <w:shd w:val="clear" w:color="auto" w:fill="FFFFFF"/>
             <w:vAlign w:val="center"/>
           </w:tcPr>
@@ -10529,7 +10529,7 @@
         </w:tc>
         <w:tc>
           <w:tcPr>
-            <w:tcW w:type="dxa" w:w="1229"/>
+            <w:tcW w:type="dxa" w:w="1166"/>
             <w:shd w:val="clear" w:color="auto" w:fill="FFFFFF"/>
             <w:vAlign w:val="center"/>
           </w:tcPr>
@@ -10553,7 +10553,7 @@
         </w:tc>
         <w:tc>
           <w:tcPr>
-            <w:tcW w:type="dxa" w:w="1404"/>
+            <w:tcW w:type="dxa" w:w="1353"/>
             <w:shd w:val="clear" w:color="auto" w:fill="FFFFFF"/>
             <w:vAlign w:val="center"/>
           </w:tcPr>
@@ -10577,7 +10577,7 @@
         </w:tc>
         <w:tc>
           <w:tcPr>
-            <w:tcW w:type="dxa" w:w="1180"/>
+            <w:tcW w:type="dxa" w:w="1092"/>
             <w:shd w:val="clear" w:color="auto" w:fill="FFFFFF"/>
             <w:vAlign w:val="center"/>
           </w:tcPr>
@@ -10606,7 +10606,7 @@
         </w:trPr>
         <w:tc>
           <w:tcPr>
-            <w:tcW w:type="dxa" w:w="2678"/>
+            <w:tcW w:type="dxa" w:w="2618"/>
             <w:shd w:val="clear" w:color="auto" w:fill="F7F9FB"/>
             <w:vAlign w:val="center"/>
           </w:tcPr>
@@ -10629,7 +10629,7 @@
         </w:tc>
         <w:tc>
           <w:tcPr>
-            <w:tcW w:type="dxa" w:w="1060"/>
+            <w:tcW w:type="dxa" w:w="1392"/>
             <w:shd w:val="clear" w:color="auto" w:fill="F7F9FB"/>
             <w:vAlign w:val="center"/>
           </w:tcPr>
@@ -10653,7 +10653,7 @@
         </w:tc>
         <w:tc>
           <w:tcPr>
-            <w:tcW w:type="dxa" w:w="945"/>
+            <w:tcW w:type="dxa" w:w="874"/>
             <w:shd w:val="clear" w:color="auto" w:fill="F7F9FB"/>
             <w:vAlign w:val="center"/>
           </w:tcPr>
@@ -10677,7 +10677,7 @@
         </w:tc>
         <w:tc>
           <w:tcPr>
-            <w:tcW w:type="dxa" w:w="1229"/>
+            <w:tcW w:type="dxa" w:w="1166"/>
             <w:shd w:val="clear" w:color="auto" w:fill="F7F9FB"/>
             <w:vAlign w:val="center"/>
           </w:tcPr>
@@ -10701,7 +10701,7 @@
         </w:tc>
         <w:tc>
           <w:tcPr>
-            <w:tcW w:type="dxa" w:w="1404"/>
+            <w:tcW w:type="dxa" w:w="1353"/>
             <w:shd w:val="clear" w:color="auto" w:fill="F7F9FB"/>
             <w:vAlign w:val="center"/>
           </w:tcPr>
@@ -10725,7 +10725,7 @@
         </w:tc>
         <w:tc>
           <w:tcPr>
-            <w:tcW w:type="dxa" w:w="1180"/>
+            <w:tcW w:type="dxa" w:w="1092"/>
             <w:shd w:val="clear" w:color="auto" w:fill="F7F9FB"/>
             <w:vAlign w:val="center"/>
           </w:tcPr>
@@ -10754,7 +10754,7 @@
         </w:trPr>
         <w:tc>
           <w:tcPr>
-            <w:tcW w:type="dxa" w:w="2678"/>
+            <w:tcW w:type="dxa" w:w="2618"/>
             <w:shd w:val="clear" w:color="auto" w:fill="FFFFFF"/>
             <w:vAlign w:val="center"/>
           </w:tcPr>
@@ -10777,7 +10777,7 @@
         </w:tc>
         <w:tc>
           <w:tcPr>
-            <w:tcW w:type="dxa" w:w="1060"/>
+            <w:tcW w:type="dxa" w:w="1392"/>
             <w:shd w:val="clear" w:color="auto" w:fill="FFFFFF"/>
             <w:vAlign w:val="center"/>
           </w:tcPr>
@@ -10801,7 +10801,7 @@
         </w:tc>
         <w:tc>
           <w:tcPr>
-            <w:tcW w:type="dxa" w:w="945"/>
+            <w:tcW w:type="dxa" w:w="874"/>
             <w:shd w:val="clear" w:color="auto" w:fill="FFFFFF"/>
             <w:vAlign w:val="center"/>
           </w:tcPr>
@@ -10825,7 +10825,7 @@
         </w:tc>
         <w:tc>
           <w:tcPr>
-            <w:tcW w:type="dxa" w:w="1229"/>
+            <w:tcW w:type="dxa" w:w="1166"/>
             <w:shd w:val="clear" w:color="auto" w:fill="FFFFFF"/>
             <w:vAlign w:val="center"/>
           </w:tcPr>
@@ -10849,7 +10849,7 @@
         </w:tc>
         <w:tc>
           <w:tcPr>
-            <w:tcW w:type="dxa" w:w="1404"/>
+            <w:tcW w:type="dxa" w:w="1353"/>
             <w:shd w:val="clear" w:color="auto" w:fill="FFFFFF"/>
             <w:vAlign w:val="center"/>
           </w:tcPr>
@@ -10873,7 +10873,7 @@
         </w:tc>
         <w:tc>
           <w:tcPr>
-            <w:tcW w:type="dxa" w:w="1180"/>
+            <w:tcW w:type="dxa" w:w="1092"/>
             <w:shd w:val="clear" w:color="auto" w:fill="FFFFFF"/>
             <w:vAlign w:val="center"/>
           </w:tcPr>
@@ -10941,17 +10941,17 @@
           <w:color w:val="156082"/>
           <w:sz w:val="21"/>
         </w:rPr>
-        <w:t>The round-1 failure replicates (passes), and more.</w:t>
-      </w:r>
-      <w:r>
-        <w:rPr>
-          <w:rFonts w:ascii="Calibri" w:hAnsi="Calibri"/>
-          <w:b w:val="0"/>
-          <w:i w:val="0"/>
-          <w:color w:val="222222"/>
-          <w:sz w:val="21"/>
-        </w:rPr>
-        <w:t xml:space="preserve"> On fresh simulations the round-1 flow fails all five parameters, not two. It was not a changed simulator: six of its own training runs, re-simulated today, came out identical (6 of 6, a check added after the result). Nor was it our evaluation code: run on the round-1 held-out set, it reproduces the round-1 pattern, </w:t>
+        <w:t>The first-round failure replicates (passes), and more.</w:t>
+      </w:r>
+      <w:r>
+        <w:rPr>
+          <w:rFonts w:ascii="Calibri" w:hAnsi="Calibri"/>
+          <w:b w:val="0"/>
+          <w:i w:val="0"/>
+          <w:color w:val="222222"/>
+          <w:sz w:val="21"/>
+        </w:rPr>
+        <w:t xml:space="preserve"> On fresh simulations the first-round flow fails all five parameters, not two. It was not a changed simulator: six of its own training runs, re-simulated today, came out identical (6 of 6, a check added after the result). Nor was it our evaluation code: run on the first-round held-out set, it reproduces the first-round pattern, </w:t>
       </w:r>
       <w:r>
         <w:rPr>
@@ -10991,7 +10991,7 @@
           <w:color w:val="222222"/>
           <w:sz w:val="21"/>
         </w:rPr>
-        <w:t xml:space="preserve"> failing at 0.0037. What the round-1 test missed, coverage shows: even on that set, the round-1 flow's 50% intervals held the true value 0.3933 to 0.47 of the time. Three hundred runs are too few for a rank test to see an over-confidence of this size reliably, so the round-1 passes were partly luck (post hoc reading).</w:t>
+        <w:t xml:space="preserve"> failing at 0.0037. What the first-round test missed, coverage shows: even on that set, the first-round flow's 50% intervals held the true value 0.3933 to 0.47 of the time. Three hundred runs are too few for a rank test to see an over-confidence of this size reliably, so the first-round passes were partly luck (post hoc reading).</w:t>
       </w:r>
     </w:p>
     <w:p>
@@ -11028,7 +11028,7 @@
           <w:color w:val="222222"/>
           <w:sz w:val="21"/>
         </w:rPr>
-        <w:t xml:space="preserve"> On the 300-run test it passes four parameters and fails </w:t>
+        <w:t xml:space="preserve"> On the primary test it passes four parameters and fails </w:t>
       </w:r>
       <w:r>
         <w:rPr>
@@ -11048,7 +11048,7 @@
           <w:color w:val="222222"/>
           <w:sz w:val="21"/>
         </w:rPr>
-        <w:t xml:space="preserve">; on all 1,000 it fails four of five (only </w:t>
+        <w:t xml:space="preserve">; on the full held-out set it fails four of five (only </w:t>
       </w:r>
       <w:r>
         <w:rPr>
@@ -11105,7 +11105,7 @@
           <w:color w:val="222222"/>
           <w:sz w:val="21"/>
         </w:rPr>
-        <w:t xml:space="preserve"> Every parameter's contraction is at or above the round-1 flow's on the same runs, less the registered margin of 0.05.</w:t>
+        <w:t xml:space="preserve"> Every parameter's contraction is at or above the first-round flow's on the same runs, less the registered margin of 0.05.</w:t>
       </w:r>
     </w:p>
     <w:p>
@@ -11142,7 +11142,7 @@
           <w:color w:val="222222"/>
           <w:sz w:val="21"/>
         </w:rPr>
-        <w:t xml:space="preserve"> The ensemble takes 1.953 s for 1,000 draws against 0.3286 s for the round-1 flow in the same process; the registered limit was 1 s. Each member is sampled separately, so the cost scales with the number of members.</w:t>
+        <w:t xml:space="preserve"> The ensemble takes 1.953 s for 1,000 draws against 0.3286 s for the first-round flow in the same process; the registered limit was 1 s. Each member is sampled separately, so the cost scales with the number of members.</w:t>
       </w:r>
     </w:p>
     <w:p>
@@ -11179,7 +11179,7 @@
           <w:color w:val="222222"/>
           <w:sz w:val="21"/>
         </w:rPr>
-        <w:t xml:space="preserve"> The round-1 flow retrained on 15,750 runs is sharper but still fails </w:t>
+        <w:t xml:space="preserve"> The first-round flow retrained on 15,750 runs is sharper but still fails </w:t>
       </w:r>
       <w:r>
         <w:rPr>
@@ -11219,7 +11219,7 @@
           <w:color w:val="222222"/>
           <w:sz w:val="21"/>
         </w:rPr>
-        <w:t xml:space="preserve">. The five-flow ensemble on the round-1 training set alone fails all five on the 300-run test. Only budget and averaging together moved </w:t>
+        <w:t xml:space="preserve">. The five-flow ensemble on the first-round training set alone fails all five on the primary test. Only budget and averaging together moved </w:t>
       </w:r>
       <w:r>
         <w:rPr>
@@ -11239,7 +11239,7 @@
           <w:color w:val="222222"/>
           <w:sz w:val="21"/>
         </w:rPr>
-        <w:t xml:space="preserve"> above p = 0.05 on the 300-run test, and on all 1,000 runs it fails there too (exploratory comparison).</w:t>
+        <w:t xml:space="preserve"> past the threshold on the 300-run test, and on the full held-out set it fails there too (exploratory comparison).</w:t>
       </w:r>
     </w:p>
     <w:p>
@@ -11309,7 +11309,7 @@
           <w:color w:val="222222"/>
           <w:sz w:val="21"/>
         </w:rPr>
-        <w:t xml:space="preserve"> only. The inhibitory knob our pharmacology sections lean on stays withheld, as do the other three. More simulations and averaging lower every parameter's rank-test statistic on the 1,000 runs (for </w:t>
+        <w:t xml:space="preserve"> only. The inhibitory knob our pharmacology sections lean on stays withheld, as do the other three. More simulations and averaging lower every parameter's rank-test statistic on the full held-out set (for </w:t>
       </w:r>
       <w:r>
         <w:rPr>
@@ -22244,7 +22244,7 @@
           <w:color w:val="222222"/>
           <w:sz w:val="21"/>
         </w:rPr>
-        <w:t>After round 1 (§16, decision D31) the round-1 flow and the five-flow ensemble were judged on the same 1,000 fresh held-out simulations. The ensemble's histograms are flatter and its coverage sits closer to the diagonal, but the U shape of over-confidence remains for four parameters.</w:t>
+        <w:t>After round 1 (§16, decision D31) the first-round flow and the five-flow ensemble were judged on the same 1,000 fresh held-out simulations. The ensemble's histograms are flatter and its coverage sits closer to the diagonal, but the U shape of over-confidence remains for four parameters.</w:t>
       </w:r>
     </w:p>
     <w:p>
@@ -22311,7 +22311,7 @@
           <w:color w:val="222222"/>
           <w:sz w:val="17"/>
         </w:rPr>
-        <w:t>SIMULATED: the round-1 flow (top) and the five-flow ensemble on 15,750 simulations (middle) on 1,000 fresh held-out simulations; grey is the band a calibrated model fills 99% of the time. Bottom: empirical against nominal coverage of central credible intervals for all four estimators.</w:t>
+        <w:t>SIMULATED: the first-round flow (top) and the five-flow ensemble on 15,750 simulations (middle) on 1,000 fresh held-out simulations; grey is the band a calibrated model fills 99% of the time. Bottom: empirical against nominal coverage of central credible intervals for all four estimators.</w:t>
       </w:r>
     </w:p>
     <w:p>

</xml_diff>

<commit_message>
Appendix K: the quick run timed on an idle machine, 519 s with every study through section 36
Co-Authored-By: Claude Opus 5.5 <noreply@anthropic.com>
</commit_message>
<xml_diff>
--- a/report/TECHNICAL_REPORT.docx
+++ b/report/TECHNICAL_REPORT.docx
@@ -28959,7 +28959,7 @@
           <w:color w:val="222222"/>
           <w:sz w:val="21"/>
         </w:rPr>
-        <w:t xml:space="preserve"> completes end to end in 544.7 s on a workstation CPU with 20 cores, and in under twenty minutes on a dual-vCPU CI runner; the two differ because </w:t>
+        <w:t xml:space="preserve"> completes end to end in 519.0 s on a workstation CPU with 20 cores, and in under twenty minutes on a dual-vCPU CI runner; the two differ because </w:t>
       </w:r>
       <w:r>
         <w:rPr>
@@ -28979,7 +28979,7 @@
           <w:color w:val="222222"/>
           <w:sz w:val="21"/>
         </w:rPr>
-        <w:t xml:space="preserve"> correctly asks for the cores it is given. The run itself writes that figure, and only a run that executed every stage can write it, so a partial re-run cannot quietly shrink it. It is one measurement rather than a bound: repeat runs on the same machine vary with whatever else the machine is doing, and the slowest we have seen crossed ten minutes. The longest stage is the twin, at 344.3 s. Full reproduction runs through </w:t>
+        <w:t xml:space="preserve"> correctly asks for the cores it is given. The run itself writes that figure, and only a run that executed every stage can write it, so a partial re-run cannot quietly shrink it. It is one measurement rather than a bound: repeat runs on the same machine vary with whatever else the machine is doing: this run was on an idle machine, with every study added through §36 included, and runs that shared the machine with other jobs took up to about twice as long, crossing ten minutes. The longest stage is the twin, at 322.5 s. Full reproduction runs through </w:t>
       </w:r>
       <w:r>
         <w:rPr>

</xml_diff>

<commit_message>
rebuild the technical report after the merge
Co-Authored-By: Claude Opus 5.5 <noreply@anthropic.com>
</commit_message>
<xml_diff>
--- a/report/TECHNICAL_REPORT.docx
+++ b/report/TECHNICAL_REPORT.docx
@@ -29349,7 +29349,7 @@
           <w:color w:val="222222"/>
           <w:sz w:val="21"/>
         </w:rPr>
-        <w:t xml:space="preserve"> completes end to end in 544.7 s on a workstation CPU with 20 cores, and in under twenty minutes on a dual-vCPU CI runner; the two differ because </w:t>
+        <w:t xml:space="preserve"> completes end to end in 519.0 s on a workstation CPU with 20 cores, and in under twenty minutes on a dual-vCPU CI runner; the two differ because </w:t>
       </w:r>
       <w:r>
         <w:rPr>
@@ -29369,7 +29369,7 @@
           <w:color w:val="222222"/>
           <w:sz w:val="21"/>
         </w:rPr>
-        <w:t xml:space="preserve"> correctly asks for the cores it is given. The run itself writes that figure, and only a run that executed every stage can write it, so a partial re-run cannot quietly shrink it. It is one measurement rather than a bound: repeat runs on the same machine vary with whatever else the machine is doing, and the slowest we have seen crossed ten minutes. The longest stage is the twin, at 344.3 s. Full reproduction runs through </w:t>
+        <w:t xml:space="preserve"> correctly asks for the cores it is given. The run itself writes that figure, and only a run that executed every stage can write it, so a partial re-run cannot quietly shrink it. It is one measurement rather than a bound: repeat runs on the same machine vary with whatever else the machine is doing: this run was on an idle machine, with every study added through §36 included, and runs that shared the machine with other jobs took up to about twice as long, crossing ten minutes. The longest stage is the twin, at 322.5 s. Full reproduction runs through </w:t>
       </w:r>
       <w:r>
         <w:rPr>

</xml_diff>